<commit_message>
Phase 23B: RDP lateral movement detection (rule 100023) - IR-2026-005 + detection engineering writeup
</commit_message>
<xml_diff>
--- a/Incidents/Issues_setting_up_Home_Lab_v22.docx
+++ b/Incidents/Issues_setting_up_Home_Lab_v22.docx
@@ -1174,52 +1174,310 @@
     </w:p>
     <w:p>
       <w:pPr>
-        <w:pStyle w:val="Normal"/>
-        <w:rPr/>
-      </w:pPr>
-      <w:r>
-        <w:rPr>
+        <w:pStyle w:val="BodyText"/>
+        <w:spacing w:lineRule="auto" w:line="278" w:before="0" w:after="160"/>
+        <w:rPr>
+          <w:rFonts w:ascii="Aptos" w:hAnsi="Aptos" w:eastAsia="Aptos" w:cs="" w:asciiTheme="minorHAnsi" w:cstheme="minorBidi" w:eastAsiaTheme="minorHAnsi" w:hAnsiTheme="minorHAnsi"/>
+          <w:color w:val="auto"/>
+          <w:sz w:val="24"/>
+          <w:szCs w:val="24"/>
+          <w14:ligatures w14:val="standardContextual"/>
+        </w:rPr>
+      </w:pPr>
+      <w:r>
+        <w:rPr>
+          <w:rFonts w:eastAsia="Aptos" w:cs="" w:cstheme="minorBidi" w:eastAsiaTheme="minorHAnsi"/>
+          <w:color w:val="auto"/>
+          <w:sz w:val="24"/>
+          <w:szCs w:val="24"/>
+          <w14:ligatures w14:val="standardContextual"/>
+        </w:rPr>
+      </w:r>
+    </w:p>
+    <w:p>
+      <w:pPr>
+        <w:pStyle w:val="BodyText"/>
+        <w:spacing w:lineRule="auto" w:line="278" w:before="0" w:after="160"/>
+        <w:rPr>
+          <w:rFonts w:ascii="Aptos" w:hAnsi="Aptos" w:eastAsia="Aptos" w:cs="" w:asciiTheme="minorHAnsi" w:cstheme="minorBidi" w:eastAsiaTheme="minorHAnsi" w:hAnsiTheme="minorHAnsi"/>
+          <w:color w:val="auto"/>
+          <w:sz w:val="24"/>
+          <w:szCs w:val="24"/>
+          <w14:ligatures w14:val="standardContextual"/>
+        </w:rPr>
+      </w:pPr>
+      <w:r>
+        <w:rPr>
+          <w:rFonts w:eastAsia="Aptos" w:cs="" w:cstheme="minorBidi" w:eastAsiaTheme="minorHAnsi"/>
+          <w:color w:val="auto"/>
+          <w:sz w:val="24"/>
+          <w:szCs w:val="24"/>
+          <w14:ligatures w14:val="standardContextual"/>
+        </w:rPr>
+        <w:t># Current Lab State</w:t>
+      </w:r>
+    </w:p>
+    <w:p>
+      <w:pPr>
+        <w:pStyle w:val="BodyText"/>
+        <w:spacing w:lineRule="auto" w:line="278" w:before="0" w:after="160"/>
+        <w:rPr>
+          <w:rFonts w:ascii="Aptos" w:hAnsi="Aptos" w:eastAsia="Aptos" w:cs="" w:asciiTheme="minorHAnsi" w:cstheme="minorBidi" w:eastAsiaTheme="minorHAnsi" w:hAnsiTheme="minorHAnsi"/>
+          <w:color w:val="auto"/>
+          <w:sz w:val="24"/>
+          <w:szCs w:val="24"/>
+          <w14:ligatures w14:val="standardContextual"/>
+        </w:rPr>
+      </w:pPr>
+      <w:r>
+        <w:rPr>
+          <w:rFonts w:eastAsia="Aptos" w:cs="" w:cstheme="minorBidi" w:eastAsiaTheme="minorHAnsi"/>
+          <w:color w:val="auto"/>
+          <w:sz w:val="24"/>
+          <w:szCs w:val="24"/>
+          <w14:ligatures w14:val="standardContextual"/>
+        </w:rPr>
+      </w:r>
+    </w:p>
+    <w:p>
+      <w:pPr>
+        <w:pStyle w:val="BodyText"/>
+        <w:spacing w:lineRule="auto" w:line="278" w:before="0" w:after="160"/>
+        <w:rPr>
+          <w:rFonts w:ascii="Aptos" w:hAnsi="Aptos" w:eastAsia="Aptos" w:cs="" w:asciiTheme="minorHAnsi" w:cstheme="minorBidi" w:eastAsiaTheme="minorHAnsi" w:hAnsiTheme="minorHAnsi"/>
+          <w:color w:val="auto"/>
+          <w:sz w:val="24"/>
+          <w:szCs w:val="24"/>
+          <w14:ligatures w14:val="standardContextual"/>
+        </w:rPr>
+      </w:pPr>
+      <w:r>
+        <w:rPr>
+          <w:rFonts w:eastAsia="Aptos" w:cs="" w:cstheme="minorBidi" w:eastAsiaTheme="minorHAnsi"/>
+          <w:color w:val="auto"/>
+          <w:sz w:val="24"/>
+          <w:szCs w:val="24"/>
+          <w14:ligatures w14:val="standardContextual"/>
+        </w:rPr>
+        <w:t>## VMnet19</w:t>
+      </w:r>
+    </w:p>
+    <w:p>
+      <w:pPr>
+        <w:pStyle w:val="BodyText"/>
+        <w:spacing w:lineRule="auto" w:line="278" w:before="0" w:after="160"/>
+        <w:rPr>
+          <w:rFonts w:ascii="Aptos" w:hAnsi="Aptos" w:eastAsia="Aptos" w:cs="" w:asciiTheme="minorHAnsi" w:cstheme="minorBidi" w:eastAsiaTheme="minorHAnsi" w:hAnsiTheme="minorHAnsi"/>
+          <w:color w:val="auto"/>
+          <w:sz w:val="24"/>
+          <w:szCs w:val="24"/>
+          <w14:ligatures w14:val="standardContextual"/>
+        </w:rPr>
+      </w:pPr>
+      <w:r>
+        <w:rPr>
+          <w:rFonts w:eastAsia="Aptos" w:cs="" w:cstheme="minorBidi" w:eastAsiaTheme="minorHAnsi"/>
+          <w:color w:val="auto"/>
+          <w:sz w:val="24"/>
+          <w:szCs w:val="24"/>
+          <w14:ligatures w14:val="standardContextual"/>
+        </w:rPr>
+        <w:t>Status: OPERATIONAL as of May 4, 2026</w:t>
+      </w:r>
+    </w:p>
+    <w:p>
+      <w:pPr>
+        <w:pStyle w:val="BodyText"/>
+        <w:spacing w:lineRule="auto" w:line="278" w:before="0" w:after="160"/>
+        <w:rPr>
+          <w:rFonts w:ascii="Aptos" w:hAnsi="Aptos" w:eastAsia="Aptos" w:cs="" w:asciiTheme="minorHAnsi" w:cstheme="minorBidi" w:eastAsiaTheme="minorHAnsi" w:hAnsiTheme="minorHAnsi"/>
+          <w:color w:val="auto"/>
+          <w:sz w:val="24"/>
+          <w:szCs w:val="24"/>
+          <w14:ligatures w14:val="standardContextual"/>
+        </w:rPr>
+      </w:pPr>
+      <w:r>
+        <w:rPr>
+          <w:rFonts w:eastAsia="Aptos" w:cs="" w:cstheme="minorBidi" w:eastAsiaTheme="minorHAnsi"/>
+          <w:color w:val="auto"/>
+          <w:sz w:val="24"/>
+          <w:szCs w:val="24"/>
+          <w14:ligatures w14:val="standardContextual"/>
+        </w:rPr>
+        <w:t>Subnet: 10.10.30.0/24, Host-only</w:t>
+      </w:r>
+    </w:p>
+    <w:p>
+      <w:pPr>
+        <w:pStyle w:val="BodyText"/>
+        <w:spacing w:lineRule="auto" w:line="278" w:before="0" w:after="160"/>
+        <w:rPr>
+          <w:rFonts w:ascii="Aptos" w:hAnsi="Aptos" w:eastAsia="Aptos" w:cs="" w:asciiTheme="minorHAnsi" w:cstheme="minorBidi" w:eastAsiaTheme="minorHAnsi" w:hAnsiTheme="minorHAnsi"/>
+          <w:color w:val="auto"/>
+          <w:sz w:val="24"/>
+          <w:szCs w:val="24"/>
+          <w14:ligatures w14:val="standardContextual"/>
+        </w:rPr>
+      </w:pPr>
+      <w:r>
+        <w:rPr>
+          <w:rFonts w:eastAsia="Aptos" w:cs="" w:cstheme="minorBidi" w:eastAsiaTheme="minorHAnsi"/>
+          <w:color w:val="auto"/>
+          <w:sz w:val="24"/>
+          <w:szCs w:val="24"/>
+          <w14:ligatures w14:val="standardContextual"/>
+        </w:rPr>
+        <w:t>Host adapter: 10.10.30.2</w:t>
+      </w:r>
+    </w:p>
+    <w:p>
+      <w:pPr>
+        <w:pStyle w:val="BodyText"/>
+        <w:spacing w:lineRule="auto" w:line="278" w:before="0" w:after="160"/>
+        <w:rPr>
+          <w:rFonts w:ascii="Aptos" w:hAnsi="Aptos" w:eastAsia="Aptos" w:cs="" w:asciiTheme="minorHAnsi" w:cstheme="minorBidi" w:eastAsiaTheme="minorHAnsi" w:hAnsiTheme="minorHAnsi"/>
+          <w:color w:val="auto"/>
+          <w:sz w:val="24"/>
+          <w:szCs w:val="24"/>
+          <w14:ligatures w14:val="standardContextual"/>
+        </w:rPr>
+      </w:pPr>
+      <w:r>
+        <w:rPr>
+          <w:rFonts w:eastAsia="Aptos" w:cs="" w:cstheme="minorBidi" w:eastAsiaTheme="minorHAnsi"/>
+          <w:color w:val="auto"/>
+          <w:sz w:val="24"/>
+          <w:szCs w:val="24"/>
+          <w14:ligatures w14:val="standardContextual"/>
+        </w:rPr>
+        <w:t>pfSense OPT2/em3: 10.10.30.1</w:t>
+      </w:r>
+    </w:p>
+    <w:p>
+      <w:pPr>
+        <w:pStyle w:val="BodyText"/>
+        <w:spacing w:lineRule="auto" w:line="278" w:before="0" w:after="160"/>
+        <w:rPr>
+          <w:rFonts w:ascii="Aptos" w:hAnsi="Aptos" w:eastAsia="Aptos" w:cs="" w:asciiTheme="minorHAnsi" w:cstheme="minorBidi" w:eastAsiaTheme="minorHAnsi" w:hAnsiTheme="minorHAnsi"/>
+          <w:color w:val="auto"/>
+          <w:sz w:val="24"/>
+          <w:szCs w:val="24"/>
+          <w14:ligatures w14:val="standardContextual"/>
+        </w:rPr>
+      </w:pPr>
+      <w:r>
+        <w:rPr>
+          <w:rFonts w:eastAsia="Aptos" w:cs="" w:cstheme="minorBidi" w:eastAsiaTheme="minorHAnsi"/>
+          <w:color w:val="auto"/>
+          <w:sz w:val="24"/>
+          <w:szCs w:val="24"/>
+          <w14:ligatures w14:val="standardContextual"/>
+        </w:rPr>
+        <w:t>All endpoints reachable. Issue 51 resolved.</w:t>
+      </w:r>
+    </w:p>
+    <w:p>
+      <w:pPr>
+        <w:pStyle w:val="BodyText"/>
+        <w:spacing w:lineRule="auto" w:line="278" w:before="0" w:after="160"/>
+        <w:rPr>
+          <w:rFonts w:ascii="Aptos" w:hAnsi="Aptos" w:eastAsia="Aptos" w:cs="" w:asciiTheme="minorHAnsi" w:cstheme="minorBidi" w:eastAsiaTheme="minorHAnsi" w:hAnsiTheme="minorHAnsi"/>
+          <w:color w:val="auto"/>
+          <w:sz w:val="24"/>
+          <w:szCs w:val="24"/>
+          <w14:ligatures w14:val="standardContextual"/>
+        </w:rPr>
+      </w:pPr>
+      <w:r>
+        <w:rPr>
+          <w:rFonts w:eastAsia="Aptos" w:cs="" w:cstheme="minorBidi" w:eastAsiaTheme="minorHAnsi"/>
+          <w:color w:val="auto"/>
+          <w:sz w:val="24"/>
+          <w:szCs w:val="24"/>
+          <w14:ligatures w14:val="standardContextual"/>
+        </w:rPr>
+      </w:r>
+    </w:p>
+    <w:p>
+      <w:pPr>
+        <w:pStyle w:val="BodyText"/>
+        <w:spacing w:lineRule="auto" w:line="278" w:before="0" w:after="160"/>
+        <w:rPr>
+          <w:rFonts w:ascii="Aptos" w:hAnsi="Aptos" w:eastAsia="Aptos" w:cs="" w:asciiTheme="minorHAnsi" w:cstheme="minorBidi" w:eastAsiaTheme="minorHAnsi" w:hAnsiTheme="minorHAnsi"/>
+          <w:color w:val="auto"/>
+          <w:sz w:val="24"/>
+          <w:szCs w:val="24"/>
+          <w14:ligatures w14:val="standardContextual"/>
+        </w:rPr>
+      </w:pPr>
+      <w:r>
+        <w:rPr>
+          <w:rFonts w:eastAsia="Aptos" w:cs="" w:cstheme="minorBidi" w:eastAsiaTheme="minorHAnsi"/>
+          <w:color w:val="auto"/>
+          <w:sz w:val="24"/>
+          <w:szCs w:val="24"/>
+          <w14:ligatures w14:val="standardContextual"/>
+        </w:rPr>
+        <w:t>## Current Phase</w:t>
+      </w:r>
+    </w:p>
+    <w:p>
+      <w:pPr>
+        <w:pStyle w:val="BodyText"/>
+        <w:spacing w:lineRule="auto" w:line="278" w:before="0" w:after="160"/>
+        <w:rPr>
+          <w:rFonts w:ascii="Aptos" w:hAnsi="Aptos" w:eastAsia="Aptos" w:cs="" w:asciiTheme="minorHAnsi" w:cstheme="minorBidi" w:eastAsiaTheme="minorHAnsi" w:hAnsiTheme="minorHAnsi"/>
+          <w:color w:val="auto"/>
+          <w:sz w:val="24"/>
+          <w:szCs w:val="24"/>
+          <w14:ligatures w14:val="standardContextual"/>
+        </w:rPr>
+      </w:pPr>
+      <w:r>
+        <w:rPr>
+          <w:rFonts w:eastAsia="Aptos" w:cs="" w:cstheme="minorBidi" w:eastAsiaTheme="minorHAnsi"/>
+          <w:color w:val="auto"/>
+          <w:sz w:val="24"/>
+          <w:szCs w:val="24"/>
+          <w14:ligatures w14:val="standardContextual"/>
+        </w:rPr>
+        <w:t>Phase 22 — Suricata IDS deployed on pfSense OPT2/em3 with Wazuh integration. ET Open ruleset active. Live alerts confirmed end-to-end.</w:t>
+      </w:r>
+    </w:p>
+    <w:p>
+      <w:pPr>
+        <w:pStyle w:val="Heading3"/>
+        <w:spacing w:lineRule="auto" w:line="278" w:before="0" w:after="160"/>
+        <w:rPr>
+          <w:rFonts w:eastAsia="Aptos" w:cs="" w:cstheme="minorBidi" w:eastAsiaTheme="minorHAnsi"/>
+          <w:color w:val="auto"/>
+          <w:sz w:val="24"/>
+          <w:szCs w:val="24"/>
+          <w14:ligatures w14:val="standardContextual"/>
+        </w:rPr>
+      </w:pPr>
+      <w:r>
+        <w:rPr>
+          <w:rFonts w:eastAsia="Aptos" w:cs="" w:cstheme="minorBidi" w:eastAsiaTheme="minorHAnsi"/>
           <w:b/>
           <w:bCs/>
-        </w:rPr>
-        <w:t>Issue 51: VMnet19 host adapter drifted to 10.10.30.1</w:t>
-      </w:r>
-      <w:r>
-        <w:rPr/>
-        <w:t xml:space="preserve">, colliding with pfSense OPT2. Root cause likely manual netsh command or interrupted script run. Fix: re-run SetVMnetIPs.ps1 or manually reset to 10.10.30.2. Detection: </w:t>
-      </w:r>
-      <w:r>
-        <w:rPr>
-          <w:rStyle w:val="SourceText"/>
-        </w:rPr>
-        <w:t>Get-NetIPAddress -InterfaceAlias 'VMware*'</w:t>
-      </w:r>
-      <w:r>
-        <w:rPr/>
-        <w:t xml:space="preserve"> shows duplicate with pfSense interface IP."</w:t>
-      </w:r>
-    </w:p>
-    <w:p>
-      <w:pPr>
-        <w:pStyle w:val="Heading2"/>
-        <w:spacing w:before="0" w:after="160"/>
-        <w:rPr>
-          <w:rFonts w:ascii="Aptos" w:hAnsi="Aptos" w:eastAsia="Aptos" w:cs="" w:asciiTheme="minorHAnsi" w:cstheme="minorBidi" w:eastAsiaTheme="minorHAnsi" w:hAnsiTheme="minorHAnsi"/>
           <w:color w:val="auto"/>
           <w:sz w:val="24"/>
           <w:szCs w:val="24"/>
           <w14:ligatures w14:val="standardContextual"/>
         </w:rPr>
-      </w:pPr>
-      <w:r>
-        <w:rPr>
-          <w:rFonts w:eastAsia="Aptos" w:cs="" w:ascii="Aptos" w:hAnsi="Aptos" w:cstheme="minorBidi" w:eastAsiaTheme="minorHAnsi"/>
+        <w:t>Issue 51</w:t>
+      </w:r>
+      <w:r>
+        <w:rPr>
+          <w:rFonts w:eastAsia="Aptos" w:cs="" w:cstheme="minorBidi" w:eastAsiaTheme="minorHAnsi"/>
           <w:color w:val="auto"/>
           <w:sz w:val="24"/>
           <w:szCs w:val="24"/>
           <w14:ligatures w14:val="standardContextual"/>
         </w:rPr>
-        <w:t>Troubleshooting Log — Issue 51: VMnet19 Total Packet Loss After Dell Reboot (Unresolved)</w:t>
+        <w:t>: VMnet19 Total Packet Loss After Dell Reboot — RESOLVED</w:t>
       </w:r>
     </w:p>
     <w:p>
@@ -1232,11 +1490,12 @@
         <w:rPr>
           <w:rStyle w:val="Strong"/>
         </w:rPr>
-        <w:t>Date:</w:t>
-      </w:r>
-      <w:r>
-        <w:rPr/>
-        <w:t xml:space="preserve"> April 20, 2026 </w:t>
+        <w:t>Date Resolved:</w:t>
+      </w:r>
+      <w:r>
+        <w:rPr/>
+        <w:t xml:space="preserve"> May 4, 2026</w:t>
+        <w:br/>
       </w:r>
       <w:r>
         <w:rPr>
@@ -1246,7 +1505,8 @@
       </w:r>
       <w:r>
         <w:rPr/>
-        <w:t xml:space="preserve"> Open — blocking Phase 22 </w:t>
+        <w:t xml:space="preserve"> Closed — Phase 22 unblocked</w:t>
+        <w:br/>
       </w:r>
       <w:r>
         <w:rPr>
@@ -1261,13 +1521,11 @@
     </w:p>
     <w:p>
       <w:pPr>
-        <w:pStyle w:val="Heading3"/>
+        <w:pStyle w:val="Heading4"/>
         <w:spacing w:before="0" w:after="160"/>
         <w:rPr>
           <w:rFonts w:eastAsia="Aptos" w:cs="" w:cstheme="minorBidi" w:eastAsiaTheme="minorHAnsi"/>
           <w:color w:val="auto"/>
-          <w:sz w:val="24"/>
-          <w:szCs w:val="24"/>
           <w14:ligatures w14:val="standardContextual"/>
         </w:rPr>
       </w:pPr>
@@ -1275,11 +1533,105 @@
         <w:rPr>
           <w:rFonts w:eastAsia="Aptos" w:cs="" w:cstheme="minorBidi" w:eastAsiaTheme="minorHAnsi"/>
           <w:color w:val="auto"/>
-          <w:sz w:val="24"/>
-          <w:szCs w:val="24"/>
-          <w14:ligatures w14:val="standardContextual"/>
-        </w:rPr>
-        <w:t>Symptoms</w:t>
+          <w14:ligatures w14:val="standardContextual"/>
+        </w:rPr>
+        <w:t>Root Cause</w:t>
+      </w:r>
+    </w:p>
+    <w:p>
+      <w:pPr>
+        <w:pStyle w:val="BodyText"/>
+        <w:spacing w:lineRule="auto" w:line="278" w:before="0" w:after="160"/>
+        <w:rPr/>
+      </w:pPr>
+      <w:r>
+        <w:rPr/>
+        <w:t xml:space="preserve">VMware Workstation Pro Repair install (attempted as a fix during the original troubleshooting) silently removed VMnet19 from the host's virtual network configuration, then created a phantom VMnet13 occupying the </w:t>
+      </w:r>
+      <w:r>
+        <w:rPr>
+          <w:rStyle w:val="SourceText"/>
+        </w:rPr>
+        <w:t>10.10.30.0/24</w:t>
+      </w:r>
+      <w:r>
+        <w:rPr/>
+        <w:t xml:space="preserve"> subnet that VMnet19 was supposed to own. The SRV-FW01 VM's Network Adapter 4 remained mapped to the now-deleted VMnet13 reference, leaving pfSense's em3/OPT2 connected to nothing on the VMware side. Frame loss was total because the underlying virtual switch did not exist.</w:t>
+      </w:r>
+    </w:p>
+    <w:p>
+      <w:pPr>
+        <w:pStyle w:val="Heading4"/>
+        <w:spacing w:before="0" w:after="160"/>
+        <w:rPr>
+          <w:rFonts w:eastAsia="Aptos" w:cs="" w:cstheme="minorBidi" w:eastAsiaTheme="minorHAnsi"/>
+          <w:color w:val="auto"/>
+          <w14:ligatures w14:val="standardContextual"/>
+        </w:rPr>
+      </w:pPr>
+      <w:r>
+        <w:rPr>
+          <w:rFonts w:eastAsia="Aptos" w:cs="" w:cstheme="minorBidi" w:eastAsiaTheme="minorHAnsi"/>
+          <w:color w:val="auto"/>
+          <w14:ligatures w14:val="standardContextual"/>
+        </w:rPr>
+        <w:t>Diagnostic Path</w:t>
+      </w:r>
+    </w:p>
+    <w:p>
+      <w:pPr>
+        <w:pStyle w:val="BodyText"/>
+        <w:spacing w:lineRule="auto" w:line="278" w:before="0" w:after="160"/>
+        <w:rPr/>
+      </w:pPr>
+      <w:r>
+        <w:rPr>
+          <w:rStyle w:val="SourceText"/>
+        </w:rPr>
+        <w:t>ipconfig /all</w:t>
+      </w:r>
+      <w:r>
+        <w:rPr/>
+        <w:t xml:space="preserve"> on the Dell after reboot showed VMnet1, VMnet8, VMnet10, VMnet11, and VMnet13 — but no VMnet19. VMnet13 reported </w:t>
+      </w:r>
+      <w:r>
+        <w:rPr>
+          <w:rStyle w:val="SourceText"/>
+        </w:rPr>
+        <w:t>IPv4 Address. . . : 10.10.30.1(Duplicate)</w:t>
+      </w:r>
+      <w:r>
+        <w:rPr/>
+        <w:t xml:space="preserve"> with APIPA fallback, confirming the subnet collision. Virtual Network Editor confirmed VMnet13 existed at </w:t>
+      </w:r>
+      <w:r>
+        <w:rPr>
+          <w:rStyle w:val="SourceText"/>
+        </w:rPr>
+        <w:t>10.10.30.0/24</w:t>
+      </w:r>
+      <w:r>
+        <w:rPr/>
+        <w:t xml:space="preserve"> with no VMnet19 anywhere in the list. Inspection of SRV-FW01's hardware settings showed Network Adapter 4 still pointing to "Custom (VMnet13)."</w:t>
+      </w:r>
+    </w:p>
+    <w:p>
+      <w:pPr>
+        <w:pStyle w:val="Heading4"/>
+        <w:spacing w:before="0" w:after="160"/>
+        <w:rPr>
+          <w:rFonts w:eastAsia="Aptos" w:cs="" w:cstheme="minorBidi" w:eastAsiaTheme="minorHAnsi"/>
+          <w:color w:val="auto"/>
+          <w14:ligatures w14:val="standardContextual"/>
+        </w:rPr>
+      </w:pPr>
+      <w:r>
+        <w:rPr>
+          <w:rFonts w:eastAsia="Aptos" w:cs="" w:cstheme="minorBidi" w:eastAsiaTheme="minorHAnsi"/>
+          <w:color w:val="auto"/>
+          <w14:ligatures w14:val="standardContextual"/>
+        </w:rPr>
+        <w:t>Resolution</w:t>
       </w:r>
     </w:p>
     <w:p>
@@ -1299,7 +1651,7 @@
       </w:pPr>
       <w:r>
         <w:rPr/>
-        <w:t xml:space="preserve">100% packet loss on VMnet19 between all endpoints: Dell host → pfSense OPT2, pfSense OPT2 → VMs, VM → VM </w:t>
+        <w:t xml:space="preserve">Deleted phantom VMnet13 in Virtual Network Editor. </w:t>
       </w:r>
     </w:p>
     <w:p>
@@ -1318,24 +1670,18 @@
         <w:rPr/>
       </w:pPr>
       <w:r>
-        <w:rPr>
-          <w:rStyle w:val="SourceText"/>
-        </w:rPr>
-        <w:t>arp -a</w:t>
-      </w:r>
-      <w:r>
-        <w:rPr/>
-        <w:t xml:space="preserve"> on Kali shows </w:t>
-      </w:r>
-      <w:r>
-        <w:rPr>
-          <w:rStyle w:val="SourceText"/>
-        </w:rPr>
-        <w:t>(incomplete)</w:t>
-      </w:r>
-      <w:r>
-        <w:rPr/>
-        <w:t xml:space="preserve"> entries for 10.10.30.0/24 hosts </w:t>
+        <w:rPr/>
+        <w:t xml:space="preserve">Added VMnet19 back: Host-only, subnet </w:t>
+      </w:r>
+      <w:r>
+        <w:rPr>
+          <w:rStyle w:val="SourceText"/>
+        </w:rPr>
+        <w:t>10.10.30.0/24</w:t>
+      </w:r>
+      <w:r>
+        <w:rPr/>
+        <w:t xml:space="preserve">, host adapter connected, DHCP disabled. </w:t>
       </w:r>
     </w:p>
     <w:p>
@@ -1355,17 +1701,27 @@
       </w:pPr>
       <w:r>
         <w:rPr/>
-        <w:t xml:space="preserve">ICMP </w:t>
-      </w:r>
-      <w:r>
-        <w:rPr>
-          <w:rStyle w:val="SourceText"/>
-        </w:rPr>
-        <w:t>Destination Host Unreachable</w:t>
-      </w:r>
-      <w:r>
-        <w:rPr/>
-        <w:t xml:space="preserve"> messages originate from the sending host itself (ARP failure), not from any gateway </w:t>
+        <w:t xml:space="preserve">Re-ran </w:t>
+      </w:r>
+      <w:r>
+        <w:rPr>
+          <w:rStyle w:val="SourceText"/>
+        </w:rPr>
+        <w:t>D:\Lab-Documentation\Scripts\SetVMnetIPs.ps1</w:t>
+      </w:r>
+      <w:r>
+        <w:rPr/>
+        <w:t xml:space="preserve"> to assign </w:t>
+      </w:r>
+      <w:r>
+        <w:rPr>
+          <w:rStyle w:val="SourceText"/>
+        </w:rPr>
+        <w:t>10.10.30.2</w:t>
+      </w:r>
+      <w:r>
+        <w:rPr/>
+        <w:t xml:space="preserve"> to the VMnet19 host adapter and enable IPv4 forwarding. </w:t>
       </w:r>
     </w:p>
     <w:p>
@@ -1385,7 +1741,27 @@
       </w:pPr>
       <w:r>
         <w:rPr/>
-        <w:t xml:space="preserve">VMnet10 (Servers) continues to work normally throughout — isolating the problem to VMnet19 </w:t>
+        <w:t xml:space="preserve">Changed SRV-FW01 Network Adapter 4 from VMnet13 to VMnet19 in VM settings. </w:t>
+      </w:r>
+    </w:p>
+    <w:p>
+      <w:pPr>
+        <w:pStyle w:val="BodyText"/>
+        <w:numPr>
+          <w:ilvl w:val="0"/>
+          <w:numId w:val="1"/>
+        </w:numPr>
+        <w:tabs>
+          <w:tab w:val="clear" w:pos="720"/>
+          <w:tab w:val="left" w:pos="0" w:leader="none"/>
+        </w:tabs>
+        <w:spacing w:lineRule="auto" w:line="278" w:before="0" w:after="0"/>
+        <w:ind w:hanging="283" w:start="709"/>
+        <w:rPr/>
+      </w:pPr>
+      <w:r>
+        <w:rPr/>
+        <w:t xml:space="preserve">Rebooted pfSense to re-initialize em3 against the new virtual switch. </w:t>
       </w:r>
     </w:p>
     <w:p>
@@ -1405,7 +1781,63 @@
       </w:pPr>
       <w:r>
         <w:rPr/>
-        <w:t xml:space="preserve">Once during troubleshooting, disabling Windows Firewall produced one ICMP reply from 10.10.30.2 before timing out the rest; not reproducible </w:t>
+        <w:t xml:space="preserve">Validated end-to-end: </w:t>
+      </w:r>
+      <w:r>
+        <w:rPr>
+          <w:rStyle w:val="SourceText"/>
+        </w:rPr>
+        <w:t>ATT-KALI01</w:t>
+      </w:r>
+      <w:r>
+        <w:rPr/>
+        <w:t xml:space="preserve"> → pfSense → DMZ-VULN01 ping replies confirmed clean (4/4, sub-ms latency). </w:t>
+      </w:r>
+    </w:p>
+    <w:p>
+      <w:pPr>
+        <w:pStyle w:val="Heading4"/>
+        <w:spacing w:before="0" w:after="160"/>
+        <w:rPr>
+          <w:rFonts w:eastAsia="Aptos" w:cs="" w:cstheme="minorBidi" w:eastAsiaTheme="minorHAnsi"/>
+          <w:color w:val="auto"/>
+          <w14:ligatures w14:val="standardContextual"/>
+        </w:rPr>
+      </w:pPr>
+      <w:r>
+        <w:rPr>
+          <w:rFonts w:eastAsia="Aptos" w:cs="" w:cstheme="minorBidi" w:eastAsiaTheme="minorHAnsi"/>
+          <w:color w:val="auto"/>
+          <w14:ligatures w14:val="standardContextual"/>
+        </w:rPr>
+        <w:t>Key Lesson</w:t>
+      </w:r>
+    </w:p>
+    <w:p>
+      <w:pPr>
+        <w:pStyle w:val="BodyText"/>
+        <w:spacing w:lineRule="auto" w:line="278" w:before="0" w:after="160"/>
+        <w:rPr/>
+      </w:pPr>
+      <w:r>
+        <w:rPr/>
+        <w:t>VMware Workstation's Repair install is destructive to virtual network configuration. It removes custom VMnets, may add phantom adapters on previously-occupied subnets, and does not update VM-to-VMnet mappings even when the underlying VMnet is deleted. Always export Virtual Network Editor configuration before running a Repair install, and verify VM adapter assignments against the post-repair VMnet list.</w:t>
+      </w:r>
+    </w:p>
+    <w:p>
+      <w:pPr>
+        <w:pStyle w:val="HorizontalLine"/>
+        <w:spacing w:before="0" w:after="160"/>
+        <w:rPr>
+          <w:sz w:val="24"/>
+          <w:szCs w:val="24"/>
+        </w:rPr>
+      </w:pPr>
+      <w:r>
+        <w:rPr>
+          <w:sz w:val="24"/>
+          <w:szCs w:val="24"/>
+        </w:rPr>
       </w:r>
     </w:p>
     <w:p>
@@ -1428,7 +1860,419 @@
           <w:szCs w:val="24"/>
           <w14:ligatures w14:val="standardContextual"/>
         </w:rPr>
-        <w:t>Environment at Time of Issue</w:t>
+        <w:t>Issue 52: Dell Host Could Not Reach pfSense OPT2 After VMnet19 Restoration</w:t>
+      </w:r>
+    </w:p>
+    <w:p>
+      <w:pPr>
+        <w:pStyle w:val="BodyText"/>
+        <w:spacing w:lineRule="auto" w:line="278" w:before="0" w:after="160"/>
+        <w:rPr/>
+      </w:pPr>
+      <w:r>
+        <w:rPr>
+          <w:rStyle w:val="Strong"/>
+        </w:rPr>
+        <w:t>Date:</w:t>
+      </w:r>
+      <w:r>
+        <w:rPr/>
+        <w:t xml:space="preserve"> May 4, 2026</w:t>
+        <w:br/>
+      </w:r>
+      <w:r>
+        <w:rPr>
+          <w:rStyle w:val="Strong"/>
+        </w:rPr>
+        <w:t>Status:</w:t>
+      </w:r>
+      <w:r>
+        <w:rPr/>
+        <w:t xml:space="preserve"> Closed — by design</w:t>
+      </w:r>
+    </w:p>
+    <w:p>
+      <w:pPr>
+        <w:pStyle w:val="BodyText"/>
+        <w:spacing w:lineRule="auto" w:line="278" w:before="0" w:after="160"/>
+        <w:rPr/>
+      </w:pPr>
+      <w:r>
+        <w:rPr/>
+        <w:t xml:space="preserve">After VMnet19 was rebuilt and the host adapter assigned </w:t>
+      </w:r>
+      <w:r>
+        <w:rPr>
+          <w:rStyle w:val="SourceText"/>
+        </w:rPr>
+        <w:t>10.10.30.2</w:t>
+      </w:r>
+      <w:r>
+        <w:rPr/>
+        <w:t xml:space="preserve">, ping from the Dell to pfSense at </w:t>
+      </w:r>
+      <w:r>
+        <w:rPr>
+          <w:rStyle w:val="SourceText"/>
+        </w:rPr>
+        <w:t>10.10.30.1</w:t>
+      </w:r>
+      <w:r>
+        <w:rPr/>
+        <w:t xml:space="preserve"> failed with destination host unreachable, then request timeouts. Reverse ping from pfSense to the Dell at </w:t>
+      </w:r>
+      <w:r>
+        <w:rPr>
+          <w:rStyle w:val="SourceText"/>
+        </w:rPr>
+        <w:t>10.10.30.2</w:t>
+      </w:r>
+      <w:r>
+        <w:rPr/>
+        <w:t xml:space="preserve"> succeeded with 4/4 replies. ARP resolution for </w:t>
+      </w:r>
+      <w:r>
+        <w:rPr>
+          <w:rStyle w:val="SourceText"/>
+        </w:rPr>
+        <w:t>10.10.30.1</w:t>
+      </w:r>
+      <w:r>
+        <w:rPr/>
+        <w:t xml:space="preserve"> worked correctly on the host side. TCP test to port 443 also failed.</w:t>
+      </w:r>
+    </w:p>
+    <w:p>
+      <w:pPr>
+        <w:pStyle w:val="Heading4"/>
+        <w:spacing w:before="0" w:after="160"/>
+        <w:rPr>
+          <w:rFonts w:eastAsia="Aptos" w:cs="" w:cstheme="minorBidi" w:eastAsiaTheme="minorHAnsi"/>
+          <w:color w:val="auto"/>
+          <w14:ligatures w14:val="standardContextual"/>
+        </w:rPr>
+      </w:pPr>
+      <w:r>
+        <w:rPr>
+          <w:rFonts w:eastAsia="Aptos" w:cs="" w:cstheme="minorBidi" w:eastAsiaTheme="minorHAnsi"/>
+          <w:color w:val="auto"/>
+          <w14:ligatures w14:val="standardContextual"/>
+        </w:rPr>
+        <w:t>Diagnostic Path</w:t>
+      </w:r>
+    </w:p>
+    <w:p>
+      <w:pPr>
+        <w:pStyle w:val="BodyText"/>
+        <w:spacing w:lineRule="auto" w:line="278" w:before="0" w:after="160"/>
+        <w:rPr/>
+      </w:pPr>
+      <w:r>
+        <w:rPr>
+          <w:rStyle w:val="SourceText"/>
+        </w:rPr>
+        <w:t>pfctl -d</w:t>
+      </w:r>
+      <w:r>
+        <w:rPr/>
+        <w:t xml:space="preserve"> on pfSense to disable packet filtering, then ping from Dell to </w:t>
+      </w:r>
+      <w:r>
+        <w:rPr>
+          <w:rStyle w:val="SourceText"/>
+        </w:rPr>
+        <w:t>10.10.30.1</w:t>
+      </w:r>
+      <w:r>
+        <w:rPr/>
+        <w:t xml:space="preserve"> — replied immediately with 4/4. Re-enabled pf with </w:t>
+      </w:r>
+      <w:r>
+        <w:rPr>
+          <w:rStyle w:val="SourceText"/>
+        </w:rPr>
+        <w:t>pfctl -e</w:t>
+      </w:r>
+      <w:r>
+        <w:rPr/>
+        <w:t xml:space="preserve">. This isolated the failure to pfSense's OPT2 firewall ruleset rather than VMnet19, host firewall, or routing. Inspection of Firewall → Rules → OPT2 in pfSense web UI showed no rule permitting traffic from </w:t>
+      </w:r>
+      <w:r>
+        <w:rPr>
+          <w:rStyle w:val="SourceText"/>
+        </w:rPr>
+        <w:t>10.10.30.2</w:t>
+      </w:r>
+      <w:r>
+        <w:rPr/>
+        <w:t xml:space="preserve"> to OPT2. The existing rules cover only DMZ-internal flows and explicit lateral-movement blocks to Servers/Clients zones.</w:t>
+      </w:r>
+    </w:p>
+    <w:p>
+      <w:pPr>
+        <w:pStyle w:val="Heading4"/>
+        <w:spacing w:before="0" w:after="160"/>
+        <w:rPr>
+          <w:rFonts w:eastAsia="Aptos" w:cs="" w:cstheme="minorBidi" w:eastAsiaTheme="minorHAnsi"/>
+          <w:color w:val="auto"/>
+          <w14:ligatures w14:val="standardContextual"/>
+        </w:rPr>
+      </w:pPr>
+      <w:r>
+        <w:rPr>
+          <w:rFonts w:eastAsia="Aptos" w:cs="" w:cstheme="minorBidi" w:eastAsiaTheme="minorHAnsi"/>
+          <w:color w:val="auto"/>
+          <w14:ligatures w14:val="standardContextual"/>
+        </w:rPr>
+        <w:t>Resolution</w:t>
+      </w:r>
+    </w:p>
+    <w:p>
+      <w:pPr>
+        <w:pStyle w:val="BodyText"/>
+        <w:spacing w:lineRule="auto" w:line="278" w:before="0" w:after="160"/>
+        <w:rPr/>
+      </w:pPr>
+      <w:r>
+        <w:rPr/>
+        <w:t>No firewall rule added. Host-to-DMZ isolation is the correct security posture for a segmented DMZ. The Dell host's role on VMnet19 is to provide IPv4 forwarding for VMs that route through it (Phase 18 architecture), not to interact with DMZ assets directly. Allowing host → DMZ access would weaken segmentation and create a privileged pivot path from any compromised host-adjacent VM. Documented as architectural decision, not a fix.</w:t>
+      </w:r>
+    </w:p>
+    <w:p>
+      <w:pPr>
+        <w:pStyle w:val="Heading4"/>
+        <w:spacing w:before="0" w:after="160"/>
+        <w:rPr>
+          <w:rFonts w:eastAsia="Aptos" w:cs="" w:cstheme="minorBidi" w:eastAsiaTheme="minorHAnsi"/>
+          <w:color w:val="auto"/>
+          <w14:ligatures w14:val="standardContextual"/>
+        </w:rPr>
+      </w:pPr>
+      <w:r>
+        <w:rPr>
+          <w:rFonts w:eastAsia="Aptos" w:cs="" w:cstheme="minorBidi" w:eastAsiaTheme="minorHAnsi"/>
+          <w:color w:val="auto"/>
+          <w14:ligatures w14:val="standardContextual"/>
+        </w:rPr>
+        <w:t>Key Lesson</w:t>
+      </w:r>
+    </w:p>
+    <w:p>
+      <w:pPr>
+        <w:pStyle w:val="BodyText"/>
+        <w:spacing w:lineRule="auto" w:line="278" w:before="0" w:after="160"/>
+        <w:rPr/>
+      </w:pPr>
+      <w:r>
+        <w:rPr/>
+        <w:t>Segmentation boundaries should be confirmed both ways during validation. Host being unable to reach a segmented zone is often a feature, not a bug. Test with a real attack VM positioned where an attacker would actually be (e.g., ATT-KALI01 on the Clients zone), not from administrative paths that should not exist in production.</w:t>
+      </w:r>
+    </w:p>
+    <w:p>
+      <w:pPr>
+        <w:pStyle w:val="HorizontalLine"/>
+        <w:spacing w:before="0" w:after="160"/>
+        <w:rPr>
+          <w:sz w:val="24"/>
+          <w:szCs w:val="24"/>
+        </w:rPr>
+      </w:pPr>
+      <w:r>
+        <w:rPr>
+          <w:sz w:val="24"/>
+          <w:szCs w:val="24"/>
+        </w:rPr>
+      </w:r>
+    </w:p>
+    <w:p>
+      <w:pPr>
+        <w:pStyle w:val="Heading3"/>
+        <w:spacing w:before="0" w:after="160"/>
+        <w:rPr>
+          <w:rFonts w:eastAsia="Aptos" w:cs="" w:cstheme="minorBidi" w:eastAsiaTheme="minorHAnsi"/>
+          <w:color w:val="auto"/>
+          <w:sz w:val="24"/>
+          <w:szCs w:val="24"/>
+          <w14:ligatures w14:val="standardContextual"/>
+        </w:rPr>
+      </w:pPr>
+      <w:r>
+        <w:rPr>
+          <w:rFonts w:eastAsia="Aptos" w:cs="" w:cstheme="minorBidi" w:eastAsiaTheme="minorHAnsi"/>
+          <w:color w:val="auto"/>
+          <w:sz w:val="24"/>
+          <w:szCs w:val="24"/>
+          <w14:ligatures w14:val="standardContextual"/>
+        </w:rPr>
+        <w:t>Issue 53: MacBook Kali → Dell Path Broken by Cox Gateway AP Isolation</w:t>
+      </w:r>
+    </w:p>
+    <w:p>
+      <w:pPr>
+        <w:pStyle w:val="BodyText"/>
+        <w:spacing w:lineRule="auto" w:line="278" w:before="0" w:after="160"/>
+        <w:rPr/>
+      </w:pPr>
+      <w:r>
+        <w:rPr>
+          <w:rStyle w:val="Strong"/>
+        </w:rPr>
+        <w:t>Date:</w:t>
+      </w:r>
+      <w:r>
+        <w:rPr/>
+        <w:t xml:space="preserve"> May 4, 2026</w:t>
+        <w:br/>
+      </w:r>
+      <w:r>
+        <w:rPr>
+          <w:rStyle w:val="Strong"/>
+        </w:rPr>
+        <w:t>Status:</w:t>
+      </w:r>
+      <w:r>
+        <w:rPr/>
+        <w:t xml:space="preserve"> Closed — Phase 18 path deprecated; ATT-KALI01 designated canonical attack source</w:t>
+      </w:r>
+    </w:p>
+    <w:p>
+      <w:pPr>
+        <w:pStyle w:val="BodyText"/>
+        <w:spacing w:lineRule="auto" w:line="278" w:before="0" w:after="160"/>
+        <w:rPr/>
+      </w:pPr>
+      <w:r>
+        <w:rPr/>
+        <w:t xml:space="preserve">After VMnet19 restoration, validation pings from MacBook Kali to DMZ-VULN01 returned "Network is unreachable." Initial cause was Kali's </w:t>
+      </w:r>
+      <w:r>
+        <w:rPr>
+          <w:rStyle w:val="SourceText"/>
+        </w:rPr>
+        <w:t>eth0</w:t>
+      </w:r>
+      <w:r>
+        <w:rPr/>
+        <w:t xml:space="preserve"> in DOWN state and no routes in the table. Brought eth0 up with </w:t>
+      </w:r>
+      <w:r>
+        <w:rPr>
+          <w:rStyle w:val="SourceText"/>
+        </w:rPr>
+        <w:t>sudo ip link set eth0 up</w:t>
+      </w:r>
+      <w:r>
+        <w:rPr/>
+        <w:t xml:space="preserve"> and </w:t>
+      </w:r>
+      <w:r>
+        <w:rPr>
+          <w:rStyle w:val="SourceText"/>
+        </w:rPr>
+        <w:t>sudo dhclient -v eth0</w:t>
+      </w:r>
+      <w:r>
+        <w:rPr/>
+        <w:t xml:space="preserve">, which assigned </w:t>
+      </w:r>
+      <w:r>
+        <w:rPr>
+          <w:rStyle w:val="SourceText"/>
+        </w:rPr>
+        <w:t>192.168.0.162</w:t>
+      </w:r>
+      <w:r>
+        <w:rPr/>
+        <w:t xml:space="preserve"> via DHCP through the MacBook's bridged Fusion adapter on Cox Wi-Fi. With routes restored, ping from Kali to the Dell at </w:t>
+      </w:r>
+      <w:r>
+        <w:rPr>
+          <w:rStyle w:val="SourceText"/>
+        </w:rPr>
+        <w:t>192.168.0.150</w:t>
+      </w:r>
+      <w:r>
+        <w:rPr/>
+        <w:t xml:space="preserve"> still failed with destination host unreachable — same signature as the earlier Lenovo → Dell failure documented during this session.</w:t>
+      </w:r>
+    </w:p>
+    <w:p>
+      <w:pPr>
+        <w:pStyle w:val="Heading4"/>
+        <w:spacing w:before="0" w:after="160"/>
+        <w:rPr>
+          <w:rFonts w:eastAsia="Aptos" w:cs="" w:cstheme="minorBidi" w:eastAsiaTheme="minorHAnsi"/>
+          <w:color w:val="auto"/>
+          <w14:ligatures w14:val="standardContextual"/>
+        </w:rPr>
+      </w:pPr>
+      <w:r>
+        <w:rPr>
+          <w:rFonts w:eastAsia="Aptos" w:cs="" w:cstheme="minorBidi" w:eastAsiaTheme="minorHAnsi"/>
+          <w:color w:val="auto"/>
+          <w14:ligatures w14:val="standardContextual"/>
+        </w:rPr>
+        <w:t>Root Cause</w:t>
+      </w:r>
+    </w:p>
+    <w:p>
+      <w:pPr>
+        <w:pStyle w:val="BodyText"/>
+        <w:spacing w:lineRule="auto" w:line="278" w:before="0" w:after="160"/>
+        <w:rPr/>
+      </w:pPr>
+      <w:r>
+        <w:rPr/>
+        <w:t>Cox Panoramic Wi-Fi gateway enforces wireless client isolation at the firmware level, blocking communication between wireless clients (MacBook on Wi-Fi, by extension MacBook Kali in bridged mode) and wired clients (Dell on ethernet). The AP isolation toggle is not exposed in Cox's web UI on this gateway model — Advanced menu only contains Port Forwarding, Port Triggering, Remote Management, DMZ, and Device Discovery. Same failure mode also blocks the Lenovo (also wireless) from reaching the Dell.</w:t>
+      </w:r>
+    </w:p>
+    <w:p>
+      <w:pPr>
+        <w:pStyle w:val="Heading4"/>
+        <w:spacing w:before="0" w:after="160"/>
+        <w:rPr>
+          <w:rFonts w:eastAsia="Aptos" w:cs="" w:cstheme="minorBidi" w:eastAsiaTheme="minorHAnsi"/>
+          <w:color w:val="auto"/>
+          <w14:ligatures w14:val="standardContextual"/>
+        </w:rPr>
+      </w:pPr>
+      <w:r>
+        <w:rPr>
+          <w:rFonts w:eastAsia="Aptos" w:cs="" w:cstheme="minorBidi" w:eastAsiaTheme="minorHAnsi"/>
+          <w:color w:val="auto"/>
+          <w14:ligatures w14:val="standardContextual"/>
+        </w:rPr>
+        <w:t>Resolution</w:t>
+      </w:r>
+    </w:p>
+    <w:p>
+      <w:pPr>
+        <w:pStyle w:val="BodyText"/>
+        <w:spacing w:lineRule="auto" w:line="278" w:before="0" w:after="160"/>
+        <w:rPr/>
+      </w:pPr>
+      <w:r>
+        <w:rPr/>
+        <w:t>Phase 18's MacBook Kali → Dell → DMZ routing path deprecated as the primary attack vector. ATT-KALI01 (already deployed on VMnet11/Clients zone) designated the canonical attack source for DMZ exploitation testing. ATT-KALI01 routes through pfSense to OPT2 via the firewall's existing rules, does not depend on Cox gateway cooperation, and more accurately models a real-world enterprise attack scenario (an attacker who has already established foothold inside the corporate client network pivoting to the DMZ).</w:t>
+      </w:r>
+    </w:p>
+    <w:p>
+      <w:pPr>
+        <w:pStyle w:val="Heading4"/>
+        <w:spacing w:before="0" w:after="160"/>
+        <w:rPr>
+          <w:rFonts w:eastAsia="Aptos" w:cs="" w:cstheme="minorBidi" w:eastAsiaTheme="minorHAnsi"/>
+          <w:color w:val="auto"/>
+          <w14:ligatures w14:val="standardContextual"/>
+        </w:rPr>
+      </w:pPr>
+      <w:r>
+        <w:rPr>
+          <w:rFonts w:eastAsia="Aptos" w:cs="" w:cstheme="minorBidi" w:eastAsiaTheme="minorHAnsi"/>
+          <w:color w:val="auto"/>
+          <w14:ligatures w14:val="standardContextual"/>
+        </w:rPr>
+        <w:t>Long-term Options Documented</w:t>
       </w:r>
     </w:p>
     <w:p>
@@ -1447,8 +2291,14 @@
         <w:rPr/>
       </w:pPr>
       <w:r>
-        <w:rPr/>
-        <w:t xml:space="preserve">Dell OptiPlex 7050, Windows 11 </w:t>
+        <w:rPr>
+          <w:rStyle w:val="Strong"/>
+        </w:rPr>
+        <w:t>USB-C ethernet adapter for Lenovo and MacBook</w:t>
+      </w:r>
+      <w:r>
+        <w:rPr/>
+        <w:t xml:space="preserve"> — restores wired-LAN reachability to the Dell, reactivates Phase 18 path. Cheap fix, partial. </w:t>
       </w:r>
     </w:p>
     <w:p>
@@ -1467,68 +2317,14 @@
         <w:rPr/>
       </w:pPr>
       <w:r>
-        <w:rPr/>
-        <w:t xml:space="preserve">VMware Workstation Pro 17.6.4 build 24832109 </w:t>
-      </w:r>
-    </w:p>
-    <w:p>
-      <w:pPr>
-        <w:pStyle w:val="BodyText"/>
-        <w:numPr>
-          <w:ilvl w:val="0"/>
-          <w:numId w:val="2"/>
-        </w:numPr>
-        <w:tabs>
-          <w:tab w:val="clear" w:pos="720"/>
-          <w:tab w:val="left" w:pos="0" w:leader="none"/>
-        </w:tabs>
-        <w:spacing w:lineRule="auto" w:line="278" w:before="0" w:after="0"/>
-        <w:ind w:hanging="283" w:start="709"/>
-        <w:rPr/>
-      </w:pPr>
-      <w:r>
-        <w:rPr/>
-        <w:t xml:space="preserve">pfSense 2.7.2-RELEASE on SRV-FW01 </w:t>
-      </w:r>
-    </w:p>
-    <w:p>
-      <w:pPr>
-        <w:pStyle w:val="BodyText"/>
-        <w:numPr>
-          <w:ilvl w:val="0"/>
-          <w:numId w:val="2"/>
-        </w:numPr>
-        <w:tabs>
-          <w:tab w:val="clear" w:pos="720"/>
-          <w:tab w:val="left" w:pos="0" w:leader="none"/>
-        </w:tabs>
-        <w:spacing w:lineRule="auto" w:line="278" w:before="0" w:after="0"/>
-        <w:ind w:hanging="283" w:start="709"/>
-        <w:rPr/>
-      </w:pPr>
-      <w:r>
-        <w:rPr/>
-        <w:t xml:space="preserve">VMnet19 configured Host-only, 10.10.30.0/24, host adapter connected, DHCP disabled </w:t>
-      </w:r>
-    </w:p>
-    <w:p>
-      <w:pPr>
-        <w:pStyle w:val="BodyText"/>
-        <w:numPr>
-          <w:ilvl w:val="0"/>
-          <w:numId w:val="2"/>
-        </w:numPr>
-        <w:tabs>
-          <w:tab w:val="clear" w:pos="720"/>
-          <w:tab w:val="left" w:pos="0" w:leader="none"/>
-        </w:tabs>
-        <w:spacing w:lineRule="auto" w:line="278" w:before="0" w:after="0"/>
-        <w:ind w:hanging="283" w:start="709"/>
-        <w:rPr/>
-      </w:pPr>
-      <w:r>
-        <w:rPr/>
-        <w:t xml:space="preserve">pfSense OPT2 assigned em3, enabled, static 10.10.30.1/24 </w:t>
+        <w:rPr>
+          <w:rStyle w:val="Strong"/>
+        </w:rPr>
+        <w:t>Cox gateway in bridge mode behind own router (e.g., Unifi, Mikrotik, second pfSense instance)</w:t>
+      </w:r>
+      <w:r>
+        <w:rPr/>
+        <w:t xml:space="preserve"> — full LAN control, eliminates AP isolation, eliminates Cox firmware lockdown, supports custom VLANs and firewall rules. Recommended as future home lab infrastructure project. </w:t>
       </w:r>
     </w:p>
     <w:p>
@@ -1547,31 +2343,101 @@
         <w:rPr/>
       </w:pPr>
       <w:r>
-        <w:rPr/>
-        <w:t xml:space="preserve">SRV-FW01 Network Adapter 4 assigned to VMnet19 </w:t>
-      </w:r>
-    </w:p>
-    <w:p>
-      <w:pPr>
-        <w:pStyle w:val="Heading3"/>
+        <w:rPr>
+          <w:rStyle w:val="Strong"/>
+        </w:rPr>
+        <w:t>Calling Cox to disable client isolation remotely</w:t>
+      </w:r>
+      <w:r>
+        <w:rPr/>
+        <w:t xml:space="preserve"> — hit-or-miss, depends on rep knowledge, may be silently re-enabled by firmware push. </w:t>
+      </w:r>
+    </w:p>
+    <w:p>
+      <w:pPr>
+        <w:pStyle w:val="Heading4"/>
         <w:spacing w:before="0" w:after="160"/>
         <w:rPr>
           <w:rFonts w:eastAsia="Aptos" w:cs="" w:cstheme="minorBidi" w:eastAsiaTheme="minorHAnsi"/>
           <w:color w:val="auto"/>
+          <w14:ligatures w14:val="standardContextual"/>
+        </w:rPr>
+      </w:pPr>
+      <w:r>
+        <w:rPr>
+          <w:rFonts w:eastAsia="Aptos" w:cs="" w:cstheme="minorBidi" w:eastAsiaTheme="minorHAnsi"/>
+          <w:color w:val="auto"/>
+          <w14:ligatures w14:val="standardContextual"/>
+        </w:rPr>
+        <w:t>Key Lesson</w:t>
+      </w:r>
+    </w:p>
+    <w:p>
+      <w:pPr>
+        <w:pStyle w:val="BodyText"/>
+        <w:spacing w:lineRule="auto" w:line="278" w:before="0" w:after="160"/>
+        <w:rPr/>
+      </w:pPr>
+      <w:r>
+        <w:rPr/>
+        <w:t>Lab architecture that depends on home network behavior is fragile. ISP-provided gateways frequently lock down or hide settings that enterprise environments take for granted. Real lab work should run entirely inside the segmented environment whenever possible, treating the home network as an untrusted upstream rather than a participant in the lab topology.</w:t>
+      </w:r>
+    </w:p>
+    <w:p>
+      <w:pPr>
+        <w:pStyle w:val="BodyText"/>
+        <w:spacing w:lineRule="auto" w:line="278" w:before="0" w:after="160"/>
+        <w:rPr/>
+      </w:pPr>
+      <w:r>
+        <w:rPr/>
+      </w:r>
+    </w:p>
+    <w:p>
+      <w:pPr>
+        <w:pStyle w:val="BodyText"/>
+        <w:spacing w:lineRule="auto" w:line="278" w:before="0" w:after="160"/>
+        <w:rPr/>
+      </w:pPr>
+      <w:r>
+        <w:rPr/>
+      </w:r>
+    </w:p>
+    <w:p>
+      <w:pPr>
+        <w:pStyle w:val="BodyText"/>
+        <w:spacing w:lineRule="auto" w:line="278" w:before="0" w:after="160"/>
+        <w:rPr/>
+      </w:pPr>
+      <w:r>
+        <w:rPr/>
+      </w:r>
+    </w:p>
+    <w:p>
+      <w:pPr>
+        <w:pStyle w:val="HorizontalLine"/>
+        <w:spacing w:before="0" w:after="160"/>
+        <w:rPr>
           <w:sz w:val="24"/>
           <w:szCs w:val="24"/>
-          <w14:ligatures w14:val="standardContextual"/>
-        </w:rPr>
-      </w:pPr>
-      <w:r>
-        <w:rPr>
-          <w:rFonts w:eastAsia="Aptos" w:cs="" w:cstheme="minorBidi" w:eastAsiaTheme="minorHAnsi"/>
-          <w:color w:val="auto"/>
+        </w:rPr>
+      </w:pPr>
+      <w:r>
+        <w:rPr>
           <w:sz w:val="24"/>
           <w:szCs w:val="24"/>
-          <w14:ligatures w14:val="standardContextual"/>
-        </w:rPr>
-        <w:t>Fixes Attempted (all unsuccessful for VMnet19)</w:t>
+        </w:rPr>
+      </w:r>
+    </w:p>
+    <w:p>
+      <w:pPr>
+        <w:pStyle w:val="BodyText"/>
+        <w:spacing w:lineRule="auto" w:line="278" w:before="0" w:after="160"/>
+        <w:rPr/>
+      </w:pPr>
+      <w:r>
+        <w:rPr/>
+        <w:t>The expansion does three things deliberately:</w:t>
       </w:r>
     </w:p>
     <w:p>
@@ -1593,21 +2459,11 @@
         <w:rPr>
           <w:rStyle w:val="Strong"/>
         </w:rPr>
-        <w:t>IP conflict resolution</w:t>
-      </w:r>
-      <w:r>
-        <w:rPr/>
-        <w:t xml:space="preserve"> — Dell VMnet19 host adapter was drifting to 10.10.30.1 (conflicting with pfSense OPT2); reset to 10.10.30.2 via </w:t>
-      </w:r>
-      <w:r>
-        <w:rPr>
-          <w:rStyle w:val="SourceText"/>
-        </w:rPr>
-        <w:t>netsh</w:t>
-      </w:r>
-      <w:r>
-        <w:rPr/>
-        <w:t xml:space="preserve">. Conflict cleared but traffic still did not flow. </w:t>
+        <w:t>Promotes Public/Private network profile</w:t>
+      </w:r>
+      <w:r>
+        <w:rPr/>
+        <w:t xml:space="preserve"> into the Windows authentication category — that bit you twice tonight (Lenovo → Dell, then VMnet19 to pfSense) and deserves billing as a recurring failure mode. </w:t>
       </w:r>
     </w:p>
     <w:p>
@@ -1629,11 +2485,11 @@
         <w:rPr>
           <w:rStyle w:val="Strong"/>
         </w:rPr>
-        <w:t>Virtual Network Editor subnet toggle</w:t>
-      </w:r>
-      <w:r>
-        <w:rPr/>
-        <w:t xml:space="preserve"> — changed VMnet19 subnet IP and reverted to force reinitialization. No effect. </w:t>
+        <w:t>Adds a seventh category</w:t>
+      </w:r>
+      <w:r>
+        <w:rPr/>
+        <w:t xml:space="preserve"> for upstream infrastructure constraints (Cox AP isolation). It didn't fit cleanly into the existing six, and it changes architectural decisions, so it deserves its own bucket. </w:t>
       </w:r>
     </w:p>
     <w:p>
@@ -1642,1563 +2498,6 @@
         <w:numPr>
           <w:ilvl w:val="0"/>
           <w:numId w:val="3"/>
-        </w:numPr>
-        <w:tabs>
-          <w:tab w:val="clear" w:pos="720"/>
-          <w:tab w:val="left" w:pos="0" w:leader="none"/>
-        </w:tabs>
-        <w:spacing w:lineRule="auto" w:line="278" w:before="0" w:after="0"/>
-        <w:ind w:hanging="283" w:start="709"/>
-        <w:rPr/>
-      </w:pPr>
-      <w:r>
-        <w:rPr>
-          <w:rStyle w:val="Strong"/>
-        </w:rPr>
-        <w:t>VMware service stack restart</w:t>
-      </w:r>
-      <w:r>
-        <w:rPr/>
-        <w:t xml:space="preserve"> — stopped and started NAT, DHCP, Authorization, USB Arbitration services. Services cycled clean. No effect. </w:t>
-      </w:r>
-    </w:p>
-    <w:p>
-      <w:pPr>
-        <w:pStyle w:val="BodyText"/>
-        <w:numPr>
-          <w:ilvl w:val="0"/>
-          <w:numId w:val="3"/>
-        </w:numPr>
-        <w:tabs>
-          <w:tab w:val="clear" w:pos="720"/>
-          <w:tab w:val="left" w:pos="0" w:leader="none"/>
-        </w:tabs>
-        <w:spacing w:lineRule="auto" w:line="278" w:before="0" w:after="0"/>
-        <w:ind w:hanging="283" w:start="709"/>
-        <w:rPr/>
-      </w:pPr>
-      <w:r>
-        <w:rPr>
-          <w:rStyle w:val="Strong"/>
-        </w:rPr>
-        <w:t>VMnet19 full removal and recreation</w:t>
-      </w:r>
-      <w:r>
-        <w:rPr/>
-        <w:t xml:space="preserve"> in Virtual Network Editor with correct Host-only config. No effect. </w:t>
-      </w:r>
-    </w:p>
-    <w:p>
-      <w:pPr>
-        <w:pStyle w:val="BodyText"/>
-        <w:numPr>
-          <w:ilvl w:val="0"/>
-          <w:numId w:val="3"/>
-        </w:numPr>
-        <w:tabs>
-          <w:tab w:val="clear" w:pos="720"/>
-          <w:tab w:val="left" w:pos="0" w:leader="none"/>
-        </w:tabs>
-        <w:spacing w:lineRule="auto" w:line="278" w:before="0" w:after="0"/>
-        <w:ind w:hanging="283" w:start="709"/>
-        <w:rPr/>
-      </w:pPr>
-      <w:r>
-        <w:rPr>
-          <w:rStyle w:val="Strong"/>
-        </w:rPr>
-        <w:t>Full Dell reboot</w:t>
-      </w:r>
-      <w:r>
-        <w:rPr/>
-        <w:t xml:space="preserve"> to clear vmnet kernel driver state. No effect. </w:t>
-      </w:r>
-    </w:p>
-    <w:p>
-      <w:pPr>
-        <w:pStyle w:val="BodyText"/>
-        <w:numPr>
-          <w:ilvl w:val="0"/>
-          <w:numId w:val="3"/>
-        </w:numPr>
-        <w:tabs>
-          <w:tab w:val="clear" w:pos="720"/>
-          <w:tab w:val="left" w:pos="0" w:leader="none"/>
-        </w:tabs>
-        <w:spacing w:lineRule="auto" w:line="278" w:before="0" w:after="0"/>
-        <w:ind w:hanging="283" w:start="709"/>
-        <w:rPr/>
-      </w:pPr>
-      <w:r>
-        <w:rPr>
-          <w:rStyle w:val="Strong"/>
-        </w:rPr>
-        <w:t>Host adapter disable/enable</w:t>
-      </w:r>
-      <w:r>
-        <w:rPr/>
-        <w:t xml:space="preserve"> via </w:t>
-      </w:r>
-      <w:r>
-        <w:rPr>
-          <w:rStyle w:val="SourceText"/>
-        </w:rPr>
-        <w:t>Disable-NetAdapter</w:t>
-      </w:r>
-      <w:r>
-        <w:rPr/>
-        <w:t xml:space="preserve"> / </w:t>
-      </w:r>
-      <w:r>
-        <w:rPr>
-          <w:rStyle w:val="SourceText"/>
-        </w:rPr>
-        <w:t>Enable-NetAdapter</w:t>
-      </w:r>
-      <w:r>
-        <w:rPr/>
-        <w:t xml:space="preserve">. </w:t>
-      </w:r>
-      <w:r>
-        <w:rPr>
-          <w:rStyle w:val="SourceText"/>
-        </w:rPr>
-        <w:t>Get-NetAdapterStatistics</w:t>
-      </w:r>
-      <w:r>
-        <w:rPr/>
-        <w:t xml:space="preserve"> returned </w:t>
-      </w:r>
-      <w:r>
-        <w:rPr>
-          <w:rStyle w:val="SourceText"/>
-        </w:rPr>
-        <w:t>ObjectNotFound</w:t>
-      </w:r>
-      <w:r>
-        <w:rPr/>
-        <w:t xml:space="preserve"> for VMnet19 specifically, suggesting incomplete NDIS binding. No effect on connectivity. </w:t>
-      </w:r>
-    </w:p>
-    <w:p>
-      <w:pPr>
-        <w:pStyle w:val="BodyText"/>
-        <w:numPr>
-          <w:ilvl w:val="0"/>
-          <w:numId w:val="3"/>
-        </w:numPr>
-        <w:tabs>
-          <w:tab w:val="clear" w:pos="720"/>
-          <w:tab w:val="left" w:pos="0" w:leader="none"/>
-        </w:tabs>
-        <w:spacing w:lineRule="auto" w:line="278" w:before="0" w:after="0"/>
-        <w:ind w:hanging="283" w:start="709"/>
-        <w:rPr/>
-      </w:pPr>
-      <w:r>
-        <w:rPr>
-          <w:rStyle w:val="Strong"/>
-        </w:rPr>
-        <w:t>vnetlib64.exe driver uninstall/reinstall</w:t>
-      </w:r>
-      <w:r>
-        <w:rPr/>
-        <w:t xml:space="preserve"> — </w:t>
-      </w:r>
-      <w:r>
-        <w:rPr>
-          <w:rStyle w:val="SourceText"/>
-        </w:rPr>
-        <w:t>uninstall vnetflt</w:t>
-      </w:r>
-      <w:r>
-        <w:rPr/>
-        <w:t xml:space="preserve">, </w:t>
-      </w:r>
-      <w:r>
-        <w:rPr>
-          <w:rStyle w:val="SourceText"/>
-        </w:rPr>
-        <w:t>uninstall vnetadapter</w:t>
-      </w:r>
-      <w:r>
-        <w:rPr/>
-        <w:t xml:space="preserve">, </w:t>
-      </w:r>
-      <w:r>
-        <w:rPr>
-          <w:rStyle w:val="SourceText"/>
-        </w:rPr>
-        <w:t>install vnetflt</w:t>
-      </w:r>
-      <w:r>
-        <w:rPr/>
-        <w:t xml:space="preserve">, </w:t>
-      </w:r>
-      <w:r>
-        <w:rPr>
-          <w:rStyle w:val="SourceText"/>
-        </w:rPr>
-        <w:t>install vnetadapter</w:t>
-      </w:r>
-      <w:r>
-        <w:rPr/>
-        <w:t xml:space="preserve">. Commands completed silently. No effect. </w:t>
-      </w:r>
-    </w:p>
-    <w:p>
-      <w:pPr>
-        <w:pStyle w:val="BodyText"/>
-        <w:numPr>
-          <w:ilvl w:val="0"/>
-          <w:numId w:val="3"/>
-        </w:numPr>
-        <w:tabs>
-          <w:tab w:val="clear" w:pos="720"/>
-          <w:tab w:val="left" w:pos="0" w:leader="none"/>
-        </w:tabs>
-        <w:spacing w:lineRule="auto" w:line="278" w:before="0" w:after="0"/>
-        <w:ind w:hanging="283" w:start="709"/>
-        <w:rPr/>
-      </w:pPr>
-      <w:r>
-        <w:rPr>
-          <w:rStyle w:val="Strong"/>
-        </w:rPr>
-        <w:t>VMware Workstation 17.6.4 repair install</w:t>
-      </w:r>
-      <w:r>
-        <w:rPr/>
-        <w:t xml:space="preserve"> via official installer from TechPowerUp mirror. Completed successfully. Reset all host adapter IPs to .1 defaults (caused new IP conflict on VMnet10 requiring manual </w:t>
-      </w:r>
-      <w:r>
-        <w:rPr>
-          <w:rStyle w:val="SourceText"/>
-        </w:rPr>
-        <w:t>netsh</w:t>
-      </w:r>
-      <w:r>
-        <w:rPr/>
-        <w:t xml:space="preserve"> fix). No effect on VMnet19. </w:t>
-      </w:r>
-    </w:p>
-    <w:p>
-      <w:pPr>
-        <w:pStyle w:val="BodyText"/>
-        <w:numPr>
-          <w:ilvl w:val="0"/>
-          <w:numId w:val="3"/>
-        </w:numPr>
-        <w:tabs>
-          <w:tab w:val="clear" w:pos="720"/>
-          <w:tab w:val="left" w:pos="0" w:leader="none"/>
-        </w:tabs>
-        <w:spacing w:lineRule="auto" w:line="278" w:before="0" w:after="0"/>
-        <w:ind w:hanging="283" w:start="709"/>
-        <w:rPr/>
-      </w:pPr>
-      <w:r>
-        <w:rPr>
-          <w:rStyle w:val="Strong"/>
-        </w:rPr>
-        <w:t>Windows Firewall rules</w:t>
-      </w:r>
-      <w:r>
-        <w:rPr/>
-        <w:t xml:space="preserve"> — created allow rules for VMnet19 adapter, both directions, protocol Any. No effect. Disabling all firewall profiles temporarily produced one ICMP reply from 10.10.30.2 (not reproducible). </w:t>
-      </w:r>
-    </w:p>
-    <w:p>
-      <w:pPr>
-        <w:pStyle w:val="BodyText"/>
-        <w:numPr>
-          <w:ilvl w:val="0"/>
-          <w:numId w:val="3"/>
-        </w:numPr>
-        <w:tabs>
-          <w:tab w:val="clear" w:pos="720"/>
-          <w:tab w:val="left" w:pos="0" w:leader="none"/>
-        </w:tabs>
-        <w:spacing w:lineRule="auto" w:line="278"/>
-        <w:ind w:hanging="283" w:start="709"/>
-        <w:rPr/>
-      </w:pPr>
-      <w:r>
-        <w:rPr>
-          <w:rStyle w:val="Strong"/>
-        </w:rPr>
-        <w:t>Recreated missing VMnet11</w:t>
-      </w:r>
-      <w:r>
-        <w:rPr/>
-        <w:t xml:space="preserve"> — Virtual Network Editor was missing VMnet11 after repair install (needed for pfSense OPT1/Clients). Added back as Host-only 10.10.20.0/24 with host adapter at 10.10.20.2. No effect on VMnet19. </w:t>
-      </w:r>
-    </w:p>
-    <w:p>
-      <w:pPr>
-        <w:pStyle w:val="Heading3"/>
-        <w:spacing w:before="0" w:after="160"/>
-        <w:rPr>
-          <w:rFonts w:eastAsia="Aptos" w:cs="" w:cstheme="minorBidi" w:eastAsiaTheme="minorHAnsi"/>
-          <w:color w:val="auto"/>
-          <w:sz w:val="24"/>
-          <w:szCs w:val="24"/>
-          <w14:ligatures w14:val="standardContextual"/>
-        </w:rPr>
-      </w:pPr>
-      <w:r>
-        <w:rPr>
-          <w:rFonts w:eastAsia="Aptos" w:cs="" w:cstheme="minorBidi" w:eastAsiaTheme="minorHAnsi"/>
-          <w:color w:val="auto"/>
-          <w:sz w:val="24"/>
-          <w:szCs w:val="24"/>
-          <w14:ligatures w14:val="standardContextual"/>
-        </w:rPr>
-        <w:t>Ruled Out</w:t>
-      </w:r>
-    </w:p>
-    <w:p>
-      <w:pPr>
-        <w:pStyle w:val="BodyText"/>
-        <w:numPr>
-          <w:ilvl w:val="0"/>
-          <w:numId w:val="4"/>
-        </w:numPr>
-        <w:tabs>
-          <w:tab w:val="clear" w:pos="720"/>
-          <w:tab w:val="left" w:pos="0" w:leader="none"/>
-        </w:tabs>
-        <w:spacing w:lineRule="auto" w:line="278" w:before="0" w:after="0"/>
-        <w:ind w:hanging="283" w:start="709"/>
-        <w:rPr/>
-      </w:pPr>
-      <w:r>
-        <w:rPr/>
-        <w:t xml:space="preserve">IP conflicts (verified multiple times after each fix) </w:t>
-      </w:r>
-    </w:p>
-    <w:p>
-      <w:pPr>
-        <w:pStyle w:val="BodyText"/>
-        <w:numPr>
-          <w:ilvl w:val="0"/>
-          <w:numId w:val="4"/>
-        </w:numPr>
-        <w:tabs>
-          <w:tab w:val="clear" w:pos="720"/>
-          <w:tab w:val="left" w:pos="0" w:leader="none"/>
-        </w:tabs>
-        <w:spacing w:lineRule="auto" w:line="278" w:before="0" w:after="0"/>
-        <w:ind w:hanging="283" w:start="709"/>
-        <w:rPr/>
-      </w:pPr>
-      <w:r>
-        <w:rPr/>
-        <w:t xml:space="preserve">pfSense configuration (OPT2 enabled, correct IP, interface shown up in console) </w:t>
-      </w:r>
-    </w:p>
-    <w:p>
-      <w:pPr>
-        <w:pStyle w:val="BodyText"/>
-        <w:numPr>
-          <w:ilvl w:val="0"/>
-          <w:numId w:val="4"/>
-        </w:numPr>
-        <w:tabs>
-          <w:tab w:val="clear" w:pos="720"/>
-          <w:tab w:val="left" w:pos="0" w:leader="none"/>
-        </w:tabs>
-        <w:spacing w:lineRule="auto" w:line="278" w:before="0" w:after="0"/>
-        <w:ind w:hanging="283" w:start="709"/>
-        <w:rPr/>
-      </w:pPr>
-      <w:r>
-        <w:rPr/>
-        <w:t xml:space="preserve">SRV-FW01 adapter-to-VMnet binding (Network Adapter 4 correctly mapped to VMnet19) </w:t>
-      </w:r>
-    </w:p>
-    <w:p>
-      <w:pPr>
-        <w:pStyle w:val="BodyText"/>
-        <w:numPr>
-          <w:ilvl w:val="0"/>
-          <w:numId w:val="4"/>
-        </w:numPr>
-        <w:tabs>
-          <w:tab w:val="clear" w:pos="720"/>
-          <w:tab w:val="left" w:pos="0" w:leader="none"/>
-        </w:tabs>
-        <w:spacing w:lineRule="auto" w:line="278" w:before="0" w:after="0"/>
-        <w:ind w:hanging="283" w:start="709"/>
-        <w:rPr/>
-      </w:pPr>
-      <w:r>
-        <w:rPr/>
-        <w:t xml:space="preserve">Virtual Network Editor config (Host-only, correct subnet, host adapter present, DHCP off) </w:t>
-      </w:r>
-    </w:p>
-    <w:p>
-      <w:pPr>
-        <w:pStyle w:val="BodyText"/>
-        <w:numPr>
-          <w:ilvl w:val="0"/>
-          <w:numId w:val="4"/>
-        </w:numPr>
-        <w:tabs>
-          <w:tab w:val="clear" w:pos="720"/>
-          <w:tab w:val="left" w:pos="0" w:leader="none"/>
-        </w:tabs>
-        <w:spacing w:lineRule="auto" w:line="278" w:before="0" w:after="0"/>
-        <w:ind w:hanging="283" w:start="709"/>
-        <w:rPr/>
-      </w:pPr>
-      <w:r>
-        <w:rPr/>
-        <w:t xml:space="preserve">VMware services state </w:t>
-      </w:r>
-    </w:p>
-    <w:p>
-      <w:pPr>
-        <w:pStyle w:val="BodyText"/>
-        <w:numPr>
-          <w:ilvl w:val="0"/>
-          <w:numId w:val="4"/>
-        </w:numPr>
-        <w:tabs>
-          <w:tab w:val="clear" w:pos="720"/>
-          <w:tab w:val="left" w:pos="0" w:leader="none"/>
-        </w:tabs>
-        <w:spacing w:lineRule="auto" w:line="278" w:before="0" w:after="0"/>
-        <w:ind w:hanging="283" w:start="709"/>
-        <w:rPr/>
-      </w:pPr>
-      <w:r>
-        <w:rPr/>
-        <w:t xml:space="preserve">vmnet driver installation (reinstalled via vnetlib64 and VMware repair) </w:t>
-      </w:r>
-    </w:p>
-    <w:p>
-      <w:pPr>
-        <w:pStyle w:val="BodyText"/>
-        <w:numPr>
-          <w:ilvl w:val="0"/>
-          <w:numId w:val="4"/>
-        </w:numPr>
-        <w:tabs>
-          <w:tab w:val="clear" w:pos="720"/>
-          <w:tab w:val="left" w:pos="0" w:leader="none"/>
-        </w:tabs>
-        <w:spacing w:lineRule="auto" w:line="278"/>
-        <w:ind w:hanging="283" w:start="709"/>
-        <w:rPr/>
-      </w:pPr>
-      <w:r>
-        <w:rPr/>
-        <w:t>Windows Firewall (rules created, also tested with firewall fully off)</w:t>
-      </w:r>
-    </w:p>
-    <w:p>
-      <w:pPr>
-        <w:pStyle w:val="Normal"/>
-        <w:rPr/>
-      </w:pPr>
-      <w:r>
-        <w:rPr/>
-        <mc:AlternateContent>
-          <mc:Choice Requires="wps">
-            <w:drawing>
-              <wp:inline distT="0" distB="0" distL="0" distR="0">
-                <wp:extent cx="5943600" cy="19050"/>
-                <wp:effectExtent l="0" t="0" r="0" b="0"/>
-                <wp:docPr id="1" name="Shape1"/>
-                <a:graphic xmlns:a="http://schemas.openxmlformats.org/drawingml/2006/main">
-                  <a:graphicData uri="http://schemas.microsoft.com/office/word/2010/wordprocessingShape">
-                    <wps:wsp>
-                      <wps:cNvSpPr/>
-                      <wps:spPr>
-                        <a:xfrm>
-                          <a:off x="0" y="0"/>
-                          <a:ext cx="5943600" cy="19080"/>
-                        </a:xfrm>
-                        <a:prstGeom prst="rect">
-                          <a:avLst/>
-                        </a:prstGeom>
-                        <a:solidFill>
-                          <a:srgbClr val="a0a0a0"/>
-                        </a:solidFill>
-                        <a:ln w="0">
-                          <a:noFill/>
-                        </a:ln>
-                      </wps:spPr>
-                      <wps:style>
-                        <a:lnRef idx="0"/>
-                        <a:fillRef idx="0"/>
-                        <a:effectRef idx="0"/>
-                        <a:fontRef idx="minor"/>
-                      </wps:style>
-                      <wps:bodyPr/>
-                    </wps:wsp>
-                  </a:graphicData>
-                </a:graphic>
-                <wp14:sizeRelH relativeFrom="page">
-                  <wp14:pctWidth>100000</wp14:pctWidth>
-                </wp14:sizeRelH>
-              </wp:inline>
-            </w:drawing>
-          </mc:Choice>
-          <mc:Fallback>
-            <w:pict>
-              <v:rect id="shape_0" fillcolor="#a0a0a0" stroked="f" o:allowincell="f" style="position:absolute;margin-left:0pt;margin-top:-1.55pt;width:467.95pt;height:1.45pt;mso-wrap-style:none;v-text-anchor:middle;mso-position-vertical:top">
-                <v:fill o:detectmouseclick="t" type="solid" color2="#5f5f5f"/>
-                <v:stroke color="#3465a4" joinstyle="round" endcap="flat"/>
-                <w10:wrap type="square"/>
-              </v:rect>
-            </w:pict>
-          </mc:Fallback>
-        </mc:AlternateContent>
-      </w:r>
-    </w:p>
-    <w:p>
-      <w:pPr>
-        <w:pStyle w:val="Heading3"/>
-        <w:spacing w:lineRule="auto" w:line="278" w:before="0" w:after="160"/>
-        <w:rPr>
-          <w:rFonts w:eastAsia="Aptos" w:cs="" w:cstheme="minorBidi" w:eastAsiaTheme="minorHAnsi"/>
-          <w:color w:val="auto"/>
-          <w:sz w:val="24"/>
-          <w:szCs w:val="24"/>
-          <w14:ligatures w14:val="standardContextual"/>
-        </w:rPr>
-      </w:pPr>
-      <w:r>
-        <w:rPr>
-          <w:rFonts w:eastAsia="Aptos" w:cs="" w:cstheme="minorBidi" w:eastAsiaTheme="minorHAnsi"/>
-          <w:color w:val="auto"/>
-          <w:sz w:val="24"/>
-          <w:szCs w:val="24"/>
-          <w14:ligatures w14:val="standardContextual"/>
-        </w:rPr>
-        <w:t>Issue 51 (Updated): VMnet19 Total Packet Loss After Dell Reboot — RESOLVED</w:t>
-      </w:r>
-    </w:p>
-    <w:p>
-      <w:pPr>
-        <w:pStyle w:val="BodyText"/>
-        <w:spacing w:lineRule="auto" w:line="278" w:before="0" w:after="160"/>
-        <w:rPr/>
-      </w:pPr>
-      <w:r>
-        <w:rPr>
-          <w:rStyle w:val="Strong"/>
-        </w:rPr>
-        <w:t>Date Resolved:</w:t>
-      </w:r>
-      <w:r>
-        <w:rPr/>
-        <w:t xml:space="preserve"> May 4, 2026</w:t>
-        <w:br/>
-      </w:r>
-      <w:r>
-        <w:rPr>
-          <w:rStyle w:val="Strong"/>
-        </w:rPr>
-        <w:t>Status:</w:t>
-      </w:r>
-      <w:r>
-        <w:rPr/>
-        <w:t xml:space="preserve"> Closed — Phase 22 unblocked</w:t>
-        <w:br/>
-      </w:r>
-      <w:r>
-        <w:rPr>
-          <w:rStyle w:val="Strong"/>
-        </w:rPr>
-        <w:t>Severity:</w:t>
-      </w:r>
-      <w:r>
-        <w:rPr/>
-        <w:t xml:space="preserve"> High — DMZ network unreachable from all sources</w:t>
-      </w:r>
-    </w:p>
-    <w:p>
-      <w:pPr>
-        <w:pStyle w:val="Heading4"/>
-        <w:spacing w:before="0" w:after="160"/>
-        <w:rPr>
-          <w:rFonts w:eastAsia="Aptos" w:cs="" w:cstheme="minorBidi" w:eastAsiaTheme="minorHAnsi"/>
-          <w:color w:val="auto"/>
-          <w14:ligatures w14:val="standardContextual"/>
-        </w:rPr>
-      </w:pPr>
-      <w:r>
-        <w:rPr>
-          <w:rFonts w:eastAsia="Aptos" w:cs="" w:cstheme="minorBidi" w:eastAsiaTheme="minorHAnsi"/>
-          <w:color w:val="auto"/>
-          <w14:ligatures w14:val="standardContextual"/>
-        </w:rPr>
-        <w:t>Root Cause</w:t>
-      </w:r>
-    </w:p>
-    <w:p>
-      <w:pPr>
-        <w:pStyle w:val="BodyText"/>
-        <w:spacing w:lineRule="auto" w:line="278" w:before="0" w:after="160"/>
-        <w:rPr/>
-      </w:pPr>
-      <w:r>
-        <w:rPr/>
-        <w:t xml:space="preserve">VMware Workstation Pro Repair install (attempted as a fix during the original troubleshooting) silently removed VMnet19 from the host's virtual network configuration, then created a phantom VMnet13 occupying the </w:t>
-      </w:r>
-      <w:r>
-        <w:rPr>
-          <w:rStyle w:val="SourceText"/>
-        </w:rPr>
-        <w:t>10.10.30.0/24</w:t>
-      </w:r>
-      <w:r>
-        <w:rPr/>
-        <w:t xml:space="preserve"> subnet that VMnet19 was supposed to own. The SRV-FW01 VM's Network Adapter 4 remained mapped to the now-deleted VMnet13 reference, leaving pfSense's em3/OPT2 connected to nothing on the VMware side. Frame loss was total because the underlying virtual switch did not exist.</w:t>
-      </w:r>
-    </w:p>
-    <w:p>
-      <w:pPr>
-        <w:pStyle w:val="Heading4"/>
-        <w:spacing w:before="0" w:after="160"/>
-        <w:rPr>
-          <w:rFonts w:eastAsia="Aptos" w:cs="" w:cstheme="minorBidi" w:eastAsiaTheme="minorHAnsi"/>
-          <w:color w:val="auto"/>
-          <w14:ligatures w14:val="standardContextual"/>
-        </w:rPr>
-      </w:pPr>
-      <w:r>
-        <w:rPr>
-          <w:rFonts w:eastAsia="Aptos" w:cs="" w:cstheme="minorBidi" w:eastAsiaTheme="minorHAnsi"/>
-          <w:color w:val="auto"/>
-          <w14:ligatures w14:val="standardContextual"/>
-        </w:rPr>
-        <w:t>Diagnostic Path</w:t>
-      </w:r>
-    </w:p>
-    <w:p>
-      <w:pPr>
-        <w:pStyle w:val="BodyText"/>
-        <w:spacing w:lineRule="auto" w:line="278" w:before="0" w:after="160"/>
-        <w:rPr/>
-      </w:pPr>
-      <w:r>
-        <w:rPr>
-          <w:rStyle w:val="SourceText"/>
-        </w:rPr>
-        <w:t>ipconfig /all</w:t>
-      </w:r>
-      <w:r>
-        <w:rPr/>
-        <w:t xml:space="preserve"> on the Dell after reboot showed VMnet1, VMnet8, VMnet10, VMnet11, and VMnet13 — but no VMnet19. VMnet13 reported </w:t>
-      </w:r>
-      <w:r>
-        <w:rPr>
-          <w:rStyle w:val="SourceText"/>
-        </w:rPr>
-        <w:t>IPv4 Address. . . : 10.10.30.1(Duplicate)</w:t>
-      </w:r>
-      <w:r>
-        <w:rPr/>
-        <w:t xml:space="preserve"> with APIPA fallback, confirming the subnet collision. Virtual Network Editor confirmed VMnet13 existed at </w:t>
-      </w:r>
-      <w:r>
-        <w:rPr>
-          <w:rStyle w:val="SourceText"/>
-        </w:rPr>
-        <w:t>10.10.30.0/24</w:t>
-      </w:r>
-      <w:r>
-        <w:rPr/>
-        <w:t xml:space="preserve"> with no VMnet19 anywhere in the list. Inspection of SRV-FW01's hardware settings showed Network Adapter 4 still pointing to "Custom (VMnet13)."</w:t>
-      </w:r>
-    </w:p>
-    <w:p>
-      <w:pPr>
-        <w:pStyle w:val="Heading4"/>
-        <w:spacing w:before="0" w:after="160"/>
-        <w:rPr>
-          <w:rFonts w:eastAsia="Aptos" w:cs="" w:cstheme="minorBidi" w:eastAsiaTheme="minorHAnsi"/>
-          <w:color w:val="auto"/>
-          <w14:ligatures w14:val="standardContextual"/>
-        </w:rPr>
-      </w:pPr>
-      <w:r>
-        <w:rPr>
-          <w:rFonts w:eastAsia="Aptos" w:cs="" w:cstheme="minorBidi" w:eastAsiaTheme="minorHAnsi"/>
-          <w:color w:val="auto"/>
-          <w14:ligatures w14:val="standardContextual"/>
-        </w:rPr>
-        <w:t>Resolution</w:t>
-      </w:r>
-    </w:p>
-    <w:p>
-      <w:pPr>
-        <w:pStyle w:val="BodyText"/>
-        <w:numPr>
-          <w:ilvl w:val="0"/>
-          <w:numId w:val="5"/>
-        </w:numPr>
-        <w:tabs>
-          <w:tab w:val="clear" w:pos="720"/>
-          <w:tab w:val="left" w:pos="0" w:leader="none"/>
-        </w:tabs>
-        <w:spacing w:lineRule="auto" w:line="278" w:before="0" w:after="0"/>
-        <w:ind w:hanging="283" w:start="709"/>
-        <w:rPr/>
-      </w:pPr>
-      <w:r>
-        <w:rPr/>
-        <w:t xml:space="preserve">Deleted phantom VMnet13 in Virtual Network Editor. </w:t>
-      </w:r>
-    </w:p>
-    <w:p>
-      <w:pPr>
-        <w:pStyle w:val="BodyText"/>
-        <w:numPr>
-          <w:ilvl w:val="0"/>
-          <w:numId w:val="5"/>
-        </w:numPr>
-        <w:tabs>
-          <w:tab w:val="clear" w:pos="720"/>
-          <w:tab w:val="left" w:pos="0" w:leader="none"/>
-        </w:tabs>
-        <w:spacing w:lineRule="auto" w:line="278" w:before="0" w:after="0"/>
-        <w:ind w:hanging="283" w:start="709"/>
-        <w:rPr/>
-      </w:pPr>
-      <w:r>
-        <w:rPr/>
-        <w:t xml:space="preserve">Added VMnet19 back: Host-only, subnet </w:t>
-      </w:r>
-      <w:r>
-        <w:rPr>
-          <w:rStyle w:val="SourceText"/>
-        </w:rPr>
-        <w:t>10.10.30.0/24</w:t>
-      </w:r>
-      <w:r>
-        <w:rPr/>
-        <w:t xml:space="preserve">, host adapter connected, DHCP disabled. </w:t>
-      </w:r>
-    </w:p>
-    <w:p>
-      <w:pPr>
-        <w:pStyle w:val="BodyText"/>
-        <w:numPr>
-          <w:ilvl w:val="0"/>
-          <w:numId w:val="5"/>
-        </w:numPr>
-        <w:tabs>
-          <w:tab w:val="clear" w:pos="720"/>
-          <w:tab w:val="left" w:pos="0" w:leader="none"/>
-        </w:tabs>
-        <w:spacing w:lineRule="auto" w:line="278" w:before="0" w:after="0"/>
-        <w:ind w:hanging="283" w:start="709"/>
-        <w:rPr/>
-      </w:pPr>
-      <w:r>
-        <w:rPr/>
-        <w:t xml:space="preserve">Re-ran </w:t>
-      </w:r>
-      <w:r>
-        <w:rPr>
-          <w:rStyle w:val="SourceText"/>
-        </w:rPr>
-        <w:t>D:\Lab-Documentation\Scripts\SetVMnetIPs.ps1</w:t>
-      </w:r>
-      <w:r>
-        <w:rPr/>
-        <w:t xml:space="preserve"> to assign </w:t>
-      </w:r>
-      <w:r>
-        <w:rPr>
-          <w:rStyle w:val="SourceText"/>
-        </w:rPr>
-        <w:t>10.10.30.2</w:t>
-      </w:r>
-      <w:r>
-        <w:rPr/>
-        <w:t xml:space="preserve"> to the VMnet19 host adapter and enable IPv4 forwarding. </w:t>
-      </w:r>
-    </w:p>
-    <w:p>
-      <w:pPr>
-        <w:pStyle w:val="BodyText"/>
-        <w:numPr>
-          <w:ilvl w:val="0"/>
-          <w:numId w:val="5"/>
-        </w:numPr>
-        <w:tabs>
-          <w:tab w:val="clear" w:pos="720"/>
-          <w:tab w:val="left" w:pos="0" w:leader="none"/>
-        </w:tabs>
-        <w:spacing w:lineRule="auto" w:line="278" w:before="0" w:after="0"/>
-        <w:ind w:hanging="283" w:start="709"/>
-        <w:rPr/>
-      </w:pPr>
-      <w:r>
-        <w:rPr/>
-        <w:t xml:space="preserve">Changed SRV-FW01 Network Adapter 4 from VMnet13 to VMnet19 in VM settings. </w:t>
-      </w:r>
-    </w:p>
-    <w:p>
-      <w:pPr>
-        <w:pStyle w:val="BodyText"/>
-        <w:numPr>
-          <w:ilvl w:val="0"/>
-          <w:numId w:val="5"/>
-        </w:numPr>
-        <w:tabs>
-          <w:tab w:val="clear" w:pos="720"/>
-          <w:tab w:val="left" w:pos="0" w:leader="none"/>
-        </w:tabs>
-        <w:spacing w:lineRule="auto" w:line="278" w:before="0" w:after="0"/>
-        <w:ind w:hanging="283" w:start="709"/>
-        <w:rPr/>
-      </w:pPr>
-      <w:r>
-        <w:rPr/>
-        <w:t xml:space="preserve">Rebooted pfSense to re-initialize em3 against the new virtual switch. </w:t>
-      </w:r>
-    </w:p>
-    <w:p>
-      <w:pPr>
-        <w:pStyle w:val="BodyText"/>
-        <w:numPr>
-          <w:ilvl w:val="0"/>
-          <w:numId w:val="5"/>
-        </w:numPr>
-        <w:tabs>
-          <w:tab w:val="clear" w:pos="720"/>
-          <w:tab w:val="left" w:pos="0" w:leader="none"/>
-        </w:tabs>
-        <w:spacing w:lineRule="auto" w:line="278"/>
-        <w:ind w:hanging="283" w:start="709"/>
-        <w:rPr/>
-      </w:pPr>
-      <w:r>
-        <w:rPr/>
-        <w:t xml:space="preserve">Validated end-to-end: </w:t>
-      </w:r>
-      <w:r>
-        <w:rPr>
-          <w:rStyle w:val="SourceText"/>
-        </w:rPr>
-        <w:t>ATT-KALI01</w:t>
-      </w:r>
-      <w:r>
-        <w:rPr/>
-        <w:t xml:space="preserve"> → pfSense → DMZ-VULN01 ping replies confirmed clean (4/4, sub-ms latency). </w:t>
-      </w:r>
-    </w:p>
-    <w:p>
-      <w:pPr>
-        <w:pStyle w:val="Heading4"/>
-        <w:spacing w:before="0" w:after="160"/>
-        <w:rPr>
-          <w:rFonts w:eastAsia="Aptos" w:cs="" w:cstheme="minorBidi" w:eastAsiaTheme="minorHAnsi"/>
-          <w:color w:val="auto"/>
-          <w14:ligatures w14:val="standardContextual"/>
-        </w:rPr>
-      </w:pPr>
-      <w:r>
-        <w:rPr>
-          <w:rFonts w:eastAsia="Aptos" w:cs="" w:cstheme="minorBidi" w:eastAsiaTheme="minorHAnsi"/>
-          <w:color w:val="auto"/>
-          <w14:ligatures w14:val="standardContextual"/>
-        </w:rPr>
-        <w:t>Key Lesson</w:t>
-      </w:r>
-    </w:p>
-    <w:p>
-      <w:pPr>
-        <w:pStyle w:val="BodyText"/>
-        <w:spacing w:lineRule="auto" w:line="278" w:before="0" w:after="160"/>
-        <w:rPr/>
-      </w:pPr>
-      <w:r>
-        <w:rPr/>
-        <w:t>VMware Workstation's Repair install is destructive to virtual network configuration. It removes custom VMnets, may add phantom adapters on previously-occupied subnets, and does not update VM-to-VMnet mappings even when the underlying VMnet is deleted. Always export Virtual Network Editor configuration before running a Repair install, and verify VM adapter assignments against the post-repair VMnet list.</w:t>
-      </w:r>
-    </w:p>
-    <w:p>
-      <w:pPr>
-        <w:pStyle w:val="HorizontalLine"/>
-        <w:spacing w:before="0" w:after="160"/>
-        <w:rPr>
-          <w:sz w:val="24"/>
-          <w:szCs w:val="24"/>
-        </w:rPr>
-      </w:pPr>
-      <w:r>
-        <w:rPr>
-          <w:sz w:val="24"/>
-          <w:szCs w:val="24"/>
-        </w:rPr>
-      </w:r>
-    </w:p>
-    <w:p>
-      <w:pPr>
-        <w:pStyle w:val="Heading3"/>
-        <w:spacing w:before="0" w:after="160"/>
-        <w:rPr>
-          <w:rFonts w:eastAsia="Aptos" w:cs="" w:cstheme="minorBidi" w:eastAsiaTheme="minorHAnsi"/>
-          <w:color w:val="auto"/>
-          <w:sz w:val="24"/>
-          <w:szCs w:val="24"/>
-          <w14:ligatures w14:val="standardContextual"/>
-        </w:rPr>
-      </w:pPr>
-      <w:r>
-        <w:rPr>
-          <w:rFonts w:eastAsia="Aptos" w:cs="" w:cstheme="minorBidi" w:eastAsiaTheme="minorHAnsi"/>
-          <w:color w:val="auto"/>
-          <w:sz w:val="24"/>
-          <w:szCs w:val="24"/>
-          <w14:ligatures w14:val="standardContextual"/>
-        </w:rPr>
-        <w:t>Issue 52: Dell Host Could Not Reach pfSense OPT2 After VMnet19 Restoration</w:t>
-      </w:r>
-    </w:p>
-    <w:p>
-      <w:pPr>
-        <w:pStyle w:val="BodyText"/>
-        <w:spacing w:lineRule="auto" w:line="278" w:before="0" w:after="160"/>
-        <w:rPr/>
-      </w:pPr>
-      <w:r>
-        <w:rPr>
-          <w:rStyle w:val="Strong"/>
-        </w:rPr>
-        <w:t>Date:</w:t>
-      </w:r>
-      <w:r>
-        <w:rPr/>
-        <w:t xml:space="preserve"> May 4, 2026</w:t>
-        <w:br/>
-      </w:r>
-      <w:r>
-        <w:rPr>
-          <w:rStyle w:val="Strong"/>
-        </w:rPr>
-        <w:t>Status:</w:t>
-      </w:r>
-      <w:r>
-        <w:rPr/>
-        <w:t xml:space="preserve"> Closed — by design</w:t>
-      </w:r>
-    </w:p>
-    <w:p>
-      <w:pPr>
-        <w:pStyle w:val="BodyText"/>
-        <w:spacing w:lineRule="auto" w:line="278" w:before="0" w:after="160"/>
-        <w:rPr/>
-      </w:pPr>
-      <w:r>
-        <w:rPr/>
-        <w:t xml:space="preserve">After VMnet19 was rebuilt and the host adapter assigned </w:t>
-      </w:r>
-      <w:r>
-        <w:rPr>
-          <w:rStyle w:val="SourceText"/>
-        </w:rPr>
-        <w:t>10.10.30.2</w:t>
-      </w:r>
-      <w:r>
-        <w:rPr/>
-        <w:t xml:space="preserve">, ping from the Dell to pfSense at </w:t>
-      </w:r>
-      <w:r>
-        <w:rPr>
-          <w:rStyle w:val="SourceText"/>
-        </w:rPr>
-        <w:t>10.10.30.1</w:t>
-      </w:r>
-      <w:r>
-        <w:rPr/>
-        <w:t xml:space="preserve"> failed with destination host unreachable, then request timeouts. Reverse ping from pfSense to the Dell at </w:t>
-      </w:r>
-      <w:r>
-        <w:rPr>
-          <w:rStyle w:val="SourceText"/>
-        </w:rPr>
-        <w:t>10.10.30.2</w:t>
-      </w:r>
-      <w:r>
-        <w:rPr/>
-        <w:t xml:space="preserve"> succeeded with 4/4 replies. ARP resolution for </w:t>
-      </w:r>
-      <w:r>
-        <w:rPr>
-          <w:rStyle w:val="SourceText"/>
-        </w:rPr>
-        <w:t>10.10.30.1</w:t>
-      </w:r>
-      <w:r>
-        <w:rPr/>
-        <w:t xml:space="preserve"> worked correctly on the host side. TCP test to port 443 also failed.</w:t>
-      </w:r>
-    </w:p>
-    <w:p>
-      <w:pPr>
-        <w:pStyle w:val="Heading4"/>
-        <w:spacing w:before="0" w:after="160"/>
-        <w:rPr>
-          <w:rFonts w:eastAsia="Aptos" w:cs="" w:cstheme="minorBidi" w:eastAsiaTheme="minorHAnsi"/>
-          <w:color w:val="auto"/>
-          <w14:ligatures w14:val="standardContextual"/>
-        </w:rPr>
-      </w:pPr>
-      <w:r>
-        <w:rPr>
-          <w:rFonts w:eastAsia="Aptos" w:cs="" w:cstheme="minorBidi" w:eastAsiaTheme="minorHAnsi"/>
-          <w:color w:val="auto"/>
-          <w14:ligatures w14:val="standardContextual"/>
-        </w:rPr>
-        <w:t>Diagnostic Path</w:t>
-      </w:r>
-    </w:p>
-    <w:p>
-      <w:pPr>
-        <w:pStyle w:val="BodyText"/>
-        <w:spacing w:lineRule="auto" w:line="278" w:before="0" w:after="160"/>
-        <w:rPr/>
-      </w:pPr>
-      <w:r>
-        <w:rPr>
-          <w:rStyle w:val="SourceText"/>
-        </w:rPr>
-        <w:t>pfctl -d</w:t>
-      </w:r>
-      <w:r>
-        <w:rPr/>
-        <w:t xml:space="preserve"> on pfSense to disable packet filtering, then ping from Dell to </w:t>
-      </w:r>
-      <w:r>
-        <w:rPr>
-          <w:rStyle w:val="SourceText"/>
-        </w:rPr>
-        <w:t>10.10.30.1</w:t>
-      </w:r>
-      <w:r>
-        <w:rPr/>
-        <w:t xml:space="preserve"> — replied immediately with 4/4. Re-enabled pf with </w:t>
-      </w:r>
-      <w:r>
-        <w:rPr>
-          <w:rStyle w:val="SourceText"/>
-        </w:rPr>
-        <w:t>pfctl -e</w:t>
-      </w:r>
-      <w:r>
-        <w:rPr/>
-        <w:t xml:space="preserve">. This isolated the failure to pfSense's OPT2 firewall ruleset rather than VMnet19, host firewall, or routing. Inspection of Firewall → Rules → OPT2 in pfSense web UI showed no rule permitting traffic from </w:t>
-      </w:r>
-      <w:r>
-        <w:rPr>
-          <w:rStyle w:val="SourceText"/>
-        </w:rPr>
-        <w:t>10.10.30.2</w:t>
-      </w:r>
-      <w:r>
-        <w:rPr/>
-        <w:t xml:space="preserve"> to OPT2. The existing rules cover only DMZ-internal flows and explicit lateral-movement blocks to Servers/Clients zones.</w:t>
-      </w:r>
-    </w:p>
-    <w:p>
-      <w:pPr>
-        <w:pStyle w:val="Heading4"/>
-        <w:spacing w:before="0" w:after="160"/>
-        <w:rPr>
-          <w:rFonts w:eastAsia="Aptos" w:cs="" w:cstheme="minorBidi" w:eastAsiaTheme="minorHAnsi"/>
-          <w:color w:val="auto"/>
-          <w14:ligatures w14:val="standardContextual"/>
-        </w:rPr>
-      </w:pPr>
-      <w:r>
-        <w:rPr>
-          <w:rFonts w:eastAsia="Aptos" w:cs="" w:cstheme="minorBidi" w:eastAsiaTheme="minorHAnsi"/>
-          <w:color w:val="auto"/>
-          <w14:ligatures w14:val="standardContextual"/>
-        </w:rPr>
-        <w:t>Resolution</w:t>
-      </w:r>
-    </w:p>
-    <w:p>
-      <w:pPr>
-        <w:pStyle w:val="BodyText"/>
-        <w:spacing w:lineRule="auto" w:line="278" w:before="0" w:after="160"/>
-        <w:rPr/>
-      </w:pPr>
-      <w:r>
-        <w:rPr/>
-        <w:t>No firewall rule added. Host-to-DMZ isolation is the correct security posture for a segmented DMZ. The Dell host's role on VMnet19 is to provide IPv4 forwarding for VMs that route through it (Phase 18 architecture), not to interact with DMZ assets directly. Allowing host → DMZ access would weaken segmentation and create a privileged pivot path from any compromised host-adjacent VM. Documented as architectural decision, not a fix.</w:t>
-      </w:r>
-    </w:p>
-    <w:p>
-      <w:pPr>
-        <w:pStyle w:val="Heading4"/>
-        <w:spacing w:before="0" w:after="160"/>
-        <w:rPr>
-          <w:rFonts w:eastAsia="Aptos" w:cs="" w:cstheme="minorBidi" w:eastAsiaTheme="minorHAnsi"/>
-          <w:color w:val="auto"/>
-          <w14:ligatures w14:val="standardContextual"/>
-        </w:rPr>
-      </w:pPr>
-      <w:r>
-        <w:rPr>
-          <w:rFonts w:eastAsia="Aptos" w:cs="" w:cstheme="minorBidi" w:eastAsiaTheme="minorHAnsi"/>
-          <w:color w:val="auto"/>
-          <w14:ligatures w14:val="standardContextual"/>
-        </w:rPr>
-        <w:t>Key Lesson</w:t>
-      </w:r>
-    </w:p>
-    <w:p>
-      <w:pPr>
-        <w:pStyle w:val="BodyText"/>
-        <w:spacing w:lineRule="auto" w:line="278" w:before="0" w:after="160"/>
-        <w:rPr/>
-      </w:pPr>
-      <w:r>
-        <w:rPr/>
-        <w:t>Segmentation boundaries should be confirmed both ways during validation. Host being unable to reach a segmented zone is often a feature, not a bug. Test with a real attack VM positioned where an attacker would actually be (e.g., ATT-KALI01 on the Clients zone), not from administrative paths that should not exist in production.</w:t>
-      </w:r>
-    </w:p>
-    <w:p>
-      <w:pPr>
-        <w:pStyle w:val="HorizontalLine"/>
-        <w:spacing w:before="0" w:after="160"/>
-        <w:rPr>
-          <w:sz w:val="24"/>
-          <w:szCs w:val="24"/>
-        </w:rPr>
-      </w:pPr>
-      <w:r>
-        <w:rPr>
-          <w:sz w:val="24"/>
-          <w:szCs w:val="24"/>
-        </w:rPr>
-      </w:r>
-    </w:p>
-    <w:p>
-      <w:pPr>
-        <w:pStyle w:val="Heading3"/>
-        <w:spacing w:before="0" w:after="160"/>
-        <w:rPr>
-          <w:rFonts w:eastAsia="Aptos" w:cs="" w:cstheme="minorBidi" w:eastAsiaTheme="minorHAnsi"/>
-          <w:color w:val="auto"/>
-          <w:sz w:val="24"/>
-          <w:szCs w:val="24"/>
-          <w14:ligatures w14:val="standardContextual"/>
-        </w:rPr>
-      </w:pPr>
-      <w:r>
-        <w:rPr>
-          <w:rFonts w:eastAsia="Aptos" w:cs="" w:cstheme="minorBidi" w:eastAsiaTheme="minorHAnsi"/>
-          <w:color w:val="auto"/>
-          <w:sz w:val="24"/>
-          <w:szCs w:val="24"/>
-          <w14:ligatures w14:val="standardContextual"/>
-        </w:rPr>
-        <w:t>Issue 53: MacBook Kali → Dell Path Broken by Cox Gateway AP Isolation</w:t>
-      </w:r>
-    </w:p>
-    <w:p>
-      <w:pPr>
-        <w:pStyle w:val="BodyText"/>
-        <w:spacing w:lineRule="auto" w:line="278" w:before="0" w:after="160"/>
-        <w:rPr/>
-      </w:pPr>
-      <w:r>
-        <w:rPr>
-          <w:rStyle w:val="Strong"/>
-        </w:rPr>
-        <w:t>Date:</w:t>
-      </w:r>
-      <w:r>
-        <w:rPr/>
-        <w:t xml:space="preserve"> May 4, 2026</w:t>
-        <w:br/>
-      </w:r>
-      <w:r>
-        <w:rPr>
-          <w:rStyle w:val="Strong"/>
-        </w:rPr>
-        <w:t>Status:</w:t>
-      </w:r>
-      <w:r>
-        <w:rPr/>
-        <w:t xml:space="preserve"> Closed — Phase 18 path deprecated; ATT-KALI01 designated canonical attack source</w:t>
-      </w:r>
-    </w:p>
-    <w:p>
-      <w:pPr>
-        <w:pStyle w:val="BodyText"/>
-        <w:spacing w:lineRule="auto" w:line="278" w:before="0" w:after="160"/>
-        <w:rPr/>
-      </w:pPr>
-      <w:r>
-        <w:rPr/>
-        <w:t xml:space="preserve">After VMnet19 restoration, validation pings from MacBook Kali to DMZ-VULN01 returned "Network is unreachable." Initial cause was Kali's </w:t>
-      </w:r>
-      <w:r>
-        <w:rPr>
-          <w:rStyle w:val="SourceText"/>
-        </w:rPr>
-        <w:t>eth0</w:t>
-      </w:r>
-      <w:r>
-        <w:rPr/>
-        <w:t xml:space="preserve"> in DOWN state and no routes in the table. Brought eth0 up with </w:t>
-      </w:r>
-      <w:r>
-        <w:rPr>
-          <w:rStyle w:val="SourceText"/>
-        </w:rPr>
-        <w:t>sudo ip link set eth0 up</w:t>
-      </w:r>
-      <w:r>
-        <w:rPr/>
-        <w:t xml:space="preserve"> and </w:t>
-      </w:r>
-      <w:r>
-        <w:rPr>
-          <w:rStyle w:val="SourceText"/>
-        </w:rPr>
-        <w:t>sudo dhclient -v eth0</w:t>
-      </w:r>
-      <w:r>
-        <w:rPr/>
-        <w:t xml:space="preserve">, which assigned </w:t>
-      </w:r>
-      <w:r>
-        <w:rPr>
-          <w:rStyle w:val="SourceText"/>
-        </w:rPr>
-        <w:t>192.168.0.162</w:t>
-      </w:r>
-      <w:r>
-        <w:rPr/>
-        <w:t xml:space="preserve"> via DHCP through the MacBook's bridged Fusion adapter on Cox Wi-Fi. With routes restored, ping from Kali to the Dell at </w:t>
-      </w:r>
-      <w:r>
-        <w:rPr>
-          <w:rStyle w:val="SourceText"/>
-        </w:rPr>
-        <w:t>192.168.0.150</w:t>
-      </w:r>
-      <w:r>
-        <w:rPr/>
-        <w:t xml:space="preserve"> still failed with destination host unreachable — same signature as the earlier Lenovo → Dell failure documented during this session.</w:t>
-      </w:r>
-    </w:p>
-    <w:p>
-      <w:pPr>
-        <w:pStyle w:val="Heading4"/>
-        <w:spacing w:before="0" w:after="160"/>
-        <w:rPr>
-          <w:rFonts w:eastAsia="Aptos" w:cs="" w:cstheme="minorBidi" w:eastAsiaTheme="minorHAnsi"/>
-          <w:color w:val="auto"/>
-          <w14:ligatures w14:val="standardContextual"/>
-        </w:rPr>
-      </w:pPr>
-      <w:r>
-        <w:rPr>
-          <w:rFonts w:eastAsia="Aptos" w:cs="" w:cstheme="minorBidi" w:eastAsiaTheme="minorHAnsi"/>
-          <w:color w:val="auto"/>
-          <w14:ligatures w14:val="standardContextual"/>
-        </w:rPr>
-        <w:t>Root Cause</w:t>
-      </w:r>
-    </w:p>
-    <w:p>
-      <w:pPr>
-        <w:pStyle w:val="BodyText"/>
-        <w:spacing w:lineRule="auto" w:line="278" w:before="0" w:after="160"/>
-        <w:rPr/>
-      </w:pPr>
-      <w:r>
-        <w:rPr/>
-        <w:t>Cox Panoramic Wi-Fi gateway enforces wireless client isolation at the firmware level, blocking communication between wireless clients (MacBook on Wi-Fi, by extension MacBook Kali in bridged mode) and wired clients (Dell on ethernet). The AP isolation toggle is not exposed in Cox's web UI on this gateway model — Advanced menu only contains Port Forwarding, Port Triggering, Remote Management, DMZ, and Device Discovery. Same failure mode also blocks the Lenovo (also wireless) from reaching the Dell.</w:t>
-      </w:r>
-    </w:p>
-    <w:p>
-      <w:pPr>
-        <w:pStyle w:val="Heading4"/>
-        <w:spacing w:before="0" w:after="160"/>
-        <w:rPr>
-          <w:rFonts w:eastAsia="Aptos" w:cs="" w:cstheme="minorBidi" w:eastAsiaTheme="minorHAnsi"/>
-          <w:color w:val="auto"/>
-          <w14:ligatures w14:val="standardContextual"/>
-        </w:rPr>
-      </w:pPr>
-      <w:r>
-        <w:rPr>
-          <w:rFonts w:eastAsia="Aptos" w:cs="" w:cstheme="minorBidi" w:eastAsiaTheme="minorHAnsi"/>
-          <w:color w:val="auto"/>
-          <w14:ligatures w14:val="standardContextual"/>
-        </w:rPr>
-        <w:t>Resolution</w:t>
-      </w:r>
-    </w:p>
-    <w:p>
-      <w:pPr>
-        <w:pStyle w:val="BodyText"/>
-        <w:spacing w:lineRule="auto" w:line="278" w:before="0" w:after="160"/>
-        <w:rPr/>
-      </w:pPr>
-      <w:r>
-        <w:rPr/>
-        <w:t>Phase 18's MacBook Kali → Dell → DMZ routing path deprecated as the primary attack vector. ATT-KALI01 (already deployed on VMnet11/Clients zone) designated the canonical attack source for DMZ exploitation testing. ATT-KALI01 routes through pfSense to OPT2 via the firewall's existing rules, does not depend on Cox gateway cooperation, and more accurately models a real-world enterprise attack scenario (an attacker who has already established foothold inside the corporate client network pivoting to the DMZ).</w:t>
-      </w:r>
-    </w:p>
-    <w:p>
-      <w:pPr>
-        <w:pStyle w:val="Heading4"/>
-        <w:spacing w:before="0" w:after="160"/>
-        <w:rPr>
-          <w:rFonts w:eastAsia="Aptos" w:cs="" w:cstheme="minorBidi" w:eastAsiaTheme="minorHAnsi"/>
-          <w:color w:val="auto"/>
-          <w14:ligatures w14:val="standardContextual"/>
-        </w:rPr>
-      </w:pPr>
-      <w:r>
-        <w:rPr>
-          <w:rFonts w:eastAsia="Aptos" w:cs="" w:cstheme="minorBidi" w:eastAsiaTheme="minorHAnsi"/>
-          <w:color w:val="auto"/>
-          <w14:ligatures w14:val="standardContextual"/>
-        </w:rPr>
-        <w:t>Long-term Options Documented</w:t>
-      </w:r>
-    </w:p>
-    <w:p>
-      <w:pPr>
-        <w:pStyle w:val="BodyText"/>
-        <w:numPr>
-          <w:ilvl w:val="0"/>
-          <w:numId w:val="6"/>
-        </w:numPr>
-        <w:tabs>
-          <w:tab w:val="clear" w:pos="720"/>
-          <w:tab w:val="left" w:pos="0" w:leader="none"/>
-        </w:tabs>
-        <w:spacing w:lineRule="auto" w:line="278" w:before="0" w:after="0"/>
-        <w:ind w:hanging="283" w:start="709"/>
-        <w:rPr/>
-      </w:pPr>
-      <w:r>
-        <w:rPr>
-          <w:rStyle w:val="Strong"/>
-        </w:rPr>
-        <w:t>USB-C ethernet adapter for Lenovo and MacBook</w:t>
-      </w:r>
-      <w:r>
-        <w:rPr/>
-        <w:t xml:space="preserve"> — restores wired-LAN reachability to the Dell, reactivates Phase 18 path. Cheap fix, partial. </w:t>
-      </w:r>
-    </w:p>
-    <w:p>
-      <w:pPr>
-        <w:pStyle w:val="BodyText"/>
-        <w:numPr>
-          <w:ilvl w:val="0"/>
-          <w:numId w:val="6"/>
-        </w:numPr>
-        <w:tabs>
-          <w:tab w:val="clear" w:pos="720"/>
-          <w:tab w:val="left" w:pos="0" w:leader="none"/>
-        </w:tabs>
-        <w:spacing w:lineRule="auto" w:line="278" w:before="0" w:after="0"/>
-        <w:ind w:hanging="283" w:start="709"/>
-        <w:rPr/>
-      </w:pPr>
-      <w:r>
-        <w:rPr>
-          <w:rStyle w:val="Strong"/>
-        </w:rPr>
-        <w:t>Cox gateway in bridge mode behind own router (e.g., Unifi, Mikrotik, second pfSense instance)</w:t>
-      </w:r>
-      <w:r>
-        <w:rPr/>
-        <w:t xml:space="preserve"> — full LAN control, eliminates AP isolation, eliminates Cox firmware lockdown, supports custom VLANs and firewall rules. Recommended as future home lab infrastructure project. </w:t>
-      </w:r>
-    </w:p>
-    <w:p>
-      <w:pPr>
-        <w:pStyle w:val="BodyText"/>
-        <w:numPr>
-          <w:ilvl w:val="0"/>
-          <w:numId w:val="6"/>
-        </w:numPr>
-        <w:tabs>
-          <w:tab w:val="clear" w:pos="720"/>
-          <w:tab w:val="left" w:pos="0" w:leader="none"/>
-        </w:tabs>
-        <w:spacing w:lineRule="auto" w:line="278"/>
-        <w:ind w:hanging="283" w:start="709"/>
-        <w:rPr/>
-      </w:pPr>
-      <w:r>
-        <w:rPr>
-          <w:rStyle w:val="Strong"/>
-        </w:rPr>
-        <w:t>Calling Cox to disable client isolation remotely</w:t>
-      </w:r>
-      <w:r>
-        <w:rPr/>
-        <w:t xml:space="preserve"> — hit-or-miss, depends on rep knowledge, may be silently re-enabled by firmware push. </w:t>
-      </w:r>
-    </w:p>
-    <w:p>
-      <w:pPr>
-        <w:pStyle w:val="Heading4"/>
-        <w:spacing w:before="0" w:after="160"/>
-        <w:rPr>
-          <w:rFonts w:eastAsia="Aptos" w:cs="" w:cstheme="minorBidi" w:eastAsiaTheme="minorHAnsi"/>
-          <w:color w:val="auto"/>
-          <w14:ligatures w14:val="standardContextual"/>
-        </w:rPr>
-      </w:pPr>
-      <w:r>
-        <w:rPr>
-          <w:rFonts w:eastAsia="Aptos" w:cs="" w:cstheme="minorBidi" w:eastAsiaTheme="minorHAnsi"/>
-          <w:color w:val="auto"/>
-          <w14:ligatures w14:val="standardContextual"/>
-        </w:rPr>
-        <w:t>Key Lesson</w:t>
-      </w:r>
-    </w:p>
-    <w:p>
-      <w:pPr>
-        <w:pStyle w:val="BodyText"/>
-        <w:spacing w:lineRule="auto" w:line="278" w:before="0" w:after="160"/>
-        <w:rPr/>
-      </w:pPr>
-      <w:r>
-        <w:rPr/>
-        <w:t>Lab architecture that depends on home network behavior is fragile. ISP-provided gateways frequently lock down or hide settings that enterprise environments take for granted. Real lab work should run entirely inside the segmented environment whenever possible, treating the home network as an untrusted upstream rather than a participant in the lab topology.</w:t>
-      </w:r>
-    </w:p>
-    <w:p>
-      <w:pPr>
-        <w:pStyle w:val="BodyText"/>
-        <w:spacing w:lineRule="auto" w:line="278" w:before="0" w:after="160"/>
-        <w:rPr/>
-      </w:pPr>
-      <w:r>
-        <w:rPr/>
-      </w:r>
-    </w:p>
-    <w:p>
-      <w:pPr>
-        <w:pStyle w:val="BodyText"/>
-        <w:spacing w:lineRule="auto" w:line="278" w:before="0" w:after="160"/>
-        <w:rPr/>
-      </w:pPr>
-      <w:r>
-        <w:rPr/>
-      </w:r>
-    </w:p>
-    <w:p>
-      <w:pPr>
-        <w:pStyle w:val="BodyText"/>
-        <w:spacing w:lineRule="auto" w:line="278" w:before="0" w:after="160"/>
-        <w:rPr/>
-      </w:pPr>
-      <w:r>
-        <w:rPr/>
-      </w:r>
-    </w:p>
-    <w:p>
-      <w:pPr>
-        <w:pStyle w:val="HorizontalLine"/>
-        <w:spacing w:before="0" w:after="160"/>
-        <w:rPr>
-          <w:sz w:val="24"/>
-          <w:szCs w:val="24"/>
-        </w:rPr>
-      </w:pPr>
-      <w:r>
-        <w:rPr>
-          <w:sz w:val="24"/>
-          <w:szCs w:val="24"/>
-        </w:rPr>
-      </w:r>
-    </w:p>
-    <w:p>
-      <w:pPr>
-        <w:pStyle w:val="BodyText"/>
-        <w:spacing w:lineRule="auto" w:line="278" w:before="0" w:after="160"/>
-        <w:rPr/>
-      </w:pPr>
-      <w:r>
-        <w:rPr/>
-        <w:t>The expansion does three things deliberately:</w:t>
-      </w:r>
-    </w:p>
-    <w:p>
-      <w:pPr>
-        <w:pStyle w:val="BodyText"/>
-        <w:numPr>
-          <w:ilvl w:val="0"/>
-          <w:numId w:val="7"/>
-        </w:numPr>
-        <w:tabs>
-          <w:tab w:val="clear" w:pos="720"/>
-          <w:tab w:val="left" w:pos="0" w:leader="none"/>
-        </w:tabs>
-        <w:spacing w:lineRule="auto" w:line="278" w:before="0" w:after="0"/>
-        <w:ind w:hanging="283" w:start="709"/>
-        <w:rPr/>
-      </w:pPr>
-      <w:r>
-        <w:rPr>
-          <w:rStyle w:val="Strong"/>
-        </w:rPr>
-        <w:t>Promotes Public/Private network profile</w:t>
-      </w:r>
-      <w:r>
-        <w:rPr/>
-        <w:t xml:space="preserve"> into the Windows authentication category — that bit you twice tonight (Lenovo → Dell, then VMnet19 to pfSense) and deserves billing as a recurring failure mode. </w:t>
-      </w:r>
-    </w:p>
-    <w:p>
-      <w:pPr>
-        <w:pStyle w:val="BodyText"/>
-        <w:numPr>
-          <w:ilvl w:val="0"/>
-          <w:numId w:val="7"/>
-        </w:numPr>
-        <w:tabs>
-          <w:tab w:val="clear" w:pos="720"/>
-          <w:tab w:val="left" w:pos="0" w:leader="none"/>
-        </w:tabs>
-        <w:spacing w:lineRule="auto" w:line="278" w:before="0" w:after="0"/>
-        <w:ind w:hanging="283" w:start="709"/>
-        <w:rPr/>
-      </w:pPr>
-      <w:r>
-        <w:rPr>
-          <w:rStyle w:val="Strong"/>
-        </w:rPr>
-        <w:t>Adds a seventh category</w:t>
-      </w:r>
-      <w:r>
-        <w:rPr/>
-        <w:t xml:space="preserve"> for upstream infrastructure constraints (Cox AP isolation). It didn't fit cleanly into the existing six, and it changes architectural decisions, so it deserves its own bucket. </w:t>
-      </w:r>
-    </w:p>
-    <w:p>
-      <w:pPr>
-        <w:pStyle w:val="BodyText"/>
-        <w:numPr>
-          <w:ilvl w:val="0"/>
-          <w:numId w:val="7"/>
         </w:numPr>
         <w:tabs>
           <w:tab w:val="clear" w:pos="720"/>
@@ -3889,8 +3188,8 @@
   <w:abstractNum w:abstractNumId="1">
     <w:lvl w:ilvl="0">
       <w:start w:val="1"/>
-      <w:numFmt w:val="bullet"/>
-      <w:lvlText w:val=""/>
+      <w:numFmt w:val="decimal"/>
+      <w:lvlText w:val="%1."/>
       <w:lvlJc w:val="start"/>
       <w:pPr>
         <w:tabs>
@@ -3898,14 +3197,12 @@
         </w:tabs>
         <w:ind w:start="709" w:hanging="283"/>
       </w:pPr>
-      <w:rPr>
-        <w:rFonts w:ascii="Symbol" w:hAnsi="Symbol" w:cs="Symbol" w:hint="default"/>
-      </w:rPr>
+      <w:rPr/>
     </w:lvl>
     <w:lvl w:ilvl="1">
       <w:start w:val="1"/>
-      <w:numFmt w:val="bullet"/>
-      <w:lvlText w:val=""/>
+      <w:numFmt w:val="decimal"/>
+      <w:lvlText w:val="%2."/>
       <w:lvlJc w:val="start"/>
       <w:pPr>
         <w:tabs>
@@ -3913,14 +3210,12 @@
         </w:tabs>
         <w:ind w:start="1418" w:hanging="283"/>
       </w:pPr>
-      <w:rPr>
-        <w:rFonts w:ascii="Symbol" w:hAnsi="Symbol" w:cs="Symbol" w:hint="default"/>
-      </w:rPr>
+      <w:rPr/>
     </w:lvl>
     <w:lvl w:ilvl="2">
       <w:start w:val="1"/>
-      <w:numFmt w:val="bullet"/>
-      <w:lvlText w:val=""/>
+      <w:numFmt w:val="decimal"/>
+      <w:lvlText w:val="%3."/>
       <w:lvlJc w:val="start"/>
       <w:pPr>
         <w:tabs>
@@ -3928,14 +3223,12 @@
         </w:tabs>
         <w:ind w:start="2127" w:hanging="283"/>
       </w:pPr>
-      <w:rPr>
-        <w:rFonts w:ascii="Symbol" w:hAnsi="Symbol" w:cs="Symbol" w:hint="default"/>
-      </w:rPr>
+      <w:rPr/>
     </w:lvl>
     <w:lvl w:ilvl="3">
       <w:start w:val="1"/>
-      <w:numFmt w:val="bullet"/>
-      <w:lvlText w:val=""/>
+      <w:numFmt w:val="decimal"/>
+      <w:lvlText w:val="%4."/>
       <w:lvlJc w:val="start"/>
       <w:pPr>
         <w:tabs>
@@ -3943,14 +3236,12 @@
         </w:tabs>
         <w:ind w:start="2836" w:hanging="283"/>
       </w:pPr>
-      <w:rPr>
-        <w:rFonts w:ascii="Symbol" w:hAnsi="Symbol" w:cs="Symbol" w:hint="default"/>
-      </w:rPr>
+      <w:rPr/>
     </w:lvl>
     <w:lvl w:ilvl="4">
       <w:start w:val="1"/>
-      <w:numFmt w:val="bullet"/>
-      <w:lvlText w:val=""/>
+      <w:numFmt w:val="decimal"/>
+      <w:lvlText w:val="%5."/>
       <w:lvlJc w:val="start"/>
       <w:pPr>
         <w:tabs>
@@ -3958,14 +3249,12 @@
         </w:tabs>
         <w:ind w:start="3545" w:hanging="283"/>
       </w:pPr>
-      <w:rPr>
-        <w:rFonts w:ascii="Symbol" w:hAnsi="Symbol" w:cs="Symbol" w:hint="default"/>
-      </w:rPr>
+      <w:rPr/>
     </w:lvl>
     <w:lvl w:ilvl="5">
       <w:start w:val="1"/>
-      <w:numFmt w:val="bullet"/>
-      <w:lvlText w:val=""/>
+      <w:numFmt w:val="decimal"/>
+      <w:lvlText w:val="%6."/>
       <w:lvlJc w:val="start"/>
       <w:pPr>
         <w:tabs>
@@ -3973,14 +3262,12 @@
         </w:tabs>
         <w:ind w:start="4254" w:hanging="283"/>
       </w:pPr>
-      <w:rPr>
-        <w:rFonts w:ascii="Symbol" w:hAnsi="Symbol" w:cs="Symbol" w:hint="default"/>
-      </w:rPr>
+      <w:rPr/>
     </w:lvl>
     <w:lvl w:ilvl="6">
       <w:start w:val="1"/>
-      <w:numFmt w:val="bullet"/>
-      <w:lvlText w:val=""/>
+      <w:numFmt w:val="decimal"/>
+      <w:lvlText w:val="%7."/>
       <w:lvlJc w:val="start"/>
       <w:pPr>
         <w:tabs>
@@ -3988,14 +3275,12 @@
         </w:tabs>
         <w:ind w:start="4963" w:hanging="283"/>
       </w:pPr>
-      <w:rPr>
-        <w:rFonts w:ascii="Symbol" w:hAnsi="Symbol" w:cs="Symbol" w:hint="default"/>
-      </w:rPr>
+      <w:rPr/>
     </w:lvl>
     <w:lvl w:ilvl="7">
       <w:start w:val="1"/>
-      <w:numFmt w:val="bullet"/>
-      <w:lvlText w:val=""/>
+      <w:numFmt w:val="decimal"/>
+      <w:lvlText w:val="%8."/>
       <w:lvlJc w:val="start"/>
       <w:pPr>
         <w:tabs>
@@ -4003,14 +3288,12 @@
         </w:tabs>
         <w:ind w:start="5672" w:hanging="283"/>
       </w:pPr>
-      <w:rPr>
-        <w:rFonts w:ascii="Symbol" w:hAnsi="Symbol" w:cs="Symbol" w:hint="default"/>
-      </w:rPr>
+      <w:rPr/>
     </w:lvl>
     <w:lvl w:ilvl="8">
       <w:start w:val="1"/>
-      <w:numFmt w:val="bullet"/>
-      <w:lvlText w:val=""/>
+      <w:numFmt w:val="decimal"/>
+      <w:lvlText w:val="%9."/>
       <w:lvlJc w:val="start"/>
       <w:pPr>
         <w:tabs>
@@ -4018,16 +3301,14 @@
         </w:tabs>
         <w:ind w:start="6381" w:hanging="283"/>
       </w:pPr>
-      <w:rPr>
-        <w:rFonts w:ascii="Symbol" w:hAnsi="Symbol" w:cs="Symbol" w:hint="default"/>
-      </w:rPr>
+      <w:rPr/>
     </w:lvl>
   </w:abstractNum>
   <w:abstractNum w:abstractNumId="2">
     <w:lvl w:ilvl="0">
       <w:start w:val="1"/>
-      <w:numFmt w:val="bullet"/>
-      <w:lvlText w:val=""/>
+      <w:numFmt w:val="decimal"/>
+      <w:lvlText w:val="%1."/>
       <w:lvlJc w:val="start"/>
       <w:pPr>
         <w:tabs>
@@ -4035,14 +3316,12 @@
         </w:tabs>
         <w:ind w:start="709" w:hanging="283"/>
       </w:pPr>
-      <w:rPr>
-        <w:rFonts w:ascii="Symbol" w:hAnsi="Symbol" w:cs="Symbol" w:hint="default"/>
-      </w:rPr>
+      <w:rPr/>
     </w:lvl>
     <w:lvl w:ilvl="1">
       <w:start w:val="1"/>
-      <w:numFmt w:val="bullet"/>
-      <w:lvlText w:val=""/>
+      <w:numFmt w:val="decimal"/>
+      <w:lvlText w:val="%2."/>
       <w:lvlJc w:val="start"/>
       <w:pPr>
         <w:tabs>
@@ -4050,14 +3329,12 @@
         </w:tabs>
         <w:ind w:start="1418" w:hanging="283"/>
       </w:pPr>
-      <w:rPr>
-        <w:rFonts w:ascii="Symbol" w:hAnsi="Symbol" w:cs="Symbol" w:hint="default"/>
-      </w:rPr>
+      <w:rPr/>
     </w:lvl>
     <w:lvl w:ilvl="2">
       <w:start w:val="1"/>
-      <w:numFmt w:val="bullet"/>
-      <w:lvlText w:val=""/>
+      <w:numFmt w:val="decimal"/>
+      <w:lvlText w:val="%3."/>
       <w:lvlJc w:val="start"/>
       <w:pPr>
         <w:tabs>
@@ -4065,14 +3342,12 @@
         </w:tabs>
         <w:ind w:start="2127" w:hanging="283"/>
       </w:pPr>
-      <w:rPr>
-        <w:rFonts w:ascii="Symbol" w:hAnsi="Symbol" w:cs="Symbol" w:hint="default"/>
-      </w:rPr>
+      <w:rPr/>
     </w:lvl>
     <w:lvl w:ilvl="3">
       <w:start w:val="1"/>
-      <w:numFmt w:val="bullet"/>
-      <w:lvlText w:val=""/>
+      <w:numFmt w:val="decimal"/>
+      <w:lvlText w:val="%4."/>
       <w:lvlJc w:val="start"/>
       <w:pPr>
         <w:tabs>
@@ -4080,14 +3355,12 @@
         </w:tabs>
         <w:ind w:start="2836" w:hanging="283"/>
       </w:pPr>
-      <w:rPr>
-        <w:rFonts w:ascii="Symbol" w:hAnsi="Symbol" w:cs="Symbol" w:hint="default"/>
-      </w:rPr>
+      <w:rPr/>
     </w:lvl>
     <w:lvl w:ilvl="4">
       <w:start w:val="1"/>
-      <w:numFmt w:val="bullet"/>
-      <w:lvlText w:val=""/>
+      <w:numFmt w:val="decimal"/>
+      <w:lvlText w:val="%5."/>
       <w:lvlJc w:val="start"/>
       <w:pPr>
         <w:tabs>
@@ -4095,14 +3368,12 @@
         </w:tabs>
         <w:ind w:start="3545" w:hanging="283"/>
       </w:pPr>
-      <w:rPr>
-        <w:rFonts w:ascii="Symbol" w:hAnsi="Symbol" w:cs="Symbol" w:hint="default"/>
-      </w:rPr>
+      <w:rPr/>
     </w:lvl>
     <w:lvl w:ilvl="5">
       <w:start w:val="1"/>
-      <w:numFmt w:val="bullet"/>
-      <w:lvlText w:val=""/>
+      <w:numFmt w:val="decimal"/>
+      <w:lvlText w:val="%6."/>
       <w:lvlJc w:val="start"/>
       <w:pPr>
         <w:tabs>
@@ -4110,14 +3381,12 @@
         </w:tabs>
         <w:ind w:start="4254" w:hanging="283"/>
       </w:pPr>
-      <w:rPr>
-        <w:rFonts w:ascii="Symbol" w:hAnsi="Symbol" w:cs="Symbol" w:hint="default"/>
-      </w:rPr>
+      <w:rPr/>
     </w:lvl>
     <w:lvl w:ilvl="6">
       <w:start w:val="1"/>
-      <w:numFmt w:val="bullet"/>
-      <w:lvlText w:val=""/>
+      <w:numFmt w:val="decimal"/>
+      <w:lvlText w:val="%7."/>
       <w:lvlJc w:val="start"/>
       <w:pPr>
         <w:tabs>
@@ -4125,14 +3394,12 @@
         </w:tabs>
         <w:ind w:start="4963" w:hanging="283"/>
       </w:pPr>
-      <w:rPr>
-        <w:rFonts w:ascii="Symbol" w:hAnsi="Symbol" w:cs="Symbol" w:hint="default"/>
-      </w:rPr>
+      <w:rPr/>
     </w:lvl>
     <w:lvl w:ilvl="7">
       <w:start w:val="1"/>
-      <w:numFmt w:val="bullet"/>
-      <w:lvlText w:val=""/>
+      <w:numFmt w:val="decimal"/>
+      <w:lvlText w:val="%8."/>
       <w:lvlJc w:val="start"/>
       <w:pPr>
         <w:tabs>
@@ -4140,14 +3407,12 @@
         </w:tabs>
         <w:ind w:start="5672" w:hanging="283"/>
       </w:pPr>
-      <w:rPr>
-        <w:rFonts w:ascii="Symbol" w:hAnsi="Symbol" w:cs="Symbol" w:hint="default"/>
-      </w:rPr>
+      <w:rPr/>
     </w:lvl>
     <w:lvl w:ilvl="8">
       <w:start w:val="1"/>
-      <w:numFmt w:val="bullet"/>
-      <w:lvlText w:val=""/>
+      <w:numFmt w:val="decimal"/>
+      <w:lvlText w:val="%9."/>
       <w:lvlJc w:val="start"/>
       <w:pPr>
         <w:tabs>
@@ -4155,9 +3420,7 @@
         </w:tabs>
         <w:ind w:start="6381" w:hanging="283"/>
       </w:pPr>
-      <w:rPr>
-        <w:rFonts w:ascii="Symbol" w:hAnsi="Symbol" w:cs="Symbol" w:hint="default"/>
-      </w:rPr>
+      <w:rPr/>
     </w:lvl>
   </w:abstractNum>
   <w:abstractNum w:abstractNumId="3">
@@ -4280,500 +3543,6 @@
     </w:lvl>
   </w:abstractNum>
   <w:abstractNum w:abstractNumId="4">
-    <w:lvl w:ilvl="0">
-      <w:start w:val="1"/>
-      <w:numFmt w:val="bullet"/>
-      <w:lvlText w:val=""/>
-      <w:lvlJc w:val="start"/>
-      <w:pPr>
-        <w:tabs>
-          <w:tab w:val="num" w:pos="709"/>
-        </w:tabs>
-        <w:ind w:start="709" w:hanging="283"/>
-      </w:pPr>
-      <w:rPr>
-        <w:rFonts w:ascii="Symbol" w:hAnsi="Symbol" w:cs="Symbol" w:hint="default"/>
-      </w:rPr>
-    </w:lvl>
-    <w:lvl w:ilvl="1">
-      <w:start w:val="1"/>
-      <w:numFmt w:val="bullet"/>
-      <w:lvlText w:val=""/>
-      <w:lvlJc w:val="start"/>
-      <w:pPr>
-        <w:tabs>
-          <w:tab w:val="num" w:pos="1418"/>
-        </w:tabs>
-        <w:ind w:start="1418" w:hanging="283"/>
-      </w:pPr>
-      <w:rPr>
-        <w:rFonts w:ascii="Symbol" w:hAnsi="Symbol" w:cs="Symbol" w:hint="default"/>
-      </w:rPr>
-    </w:lvl>
-    <w:lvl w:ilvl="2">
-      <w:start w:val="1"/>
-      <w:numFmt w:val="bullet"/>
-      <w:lvlText w:val=""/>
-      <w:lvlJc w:val="start"/>
-      <w:pPr>
-        <w:tabs>
-          <w:tab w:val="num" w:pos="2127"/>
-        </w:tabs>
-        <w:ind w:start="2127" w:hanging="283"/>
-      </w:pPr>
-      <w:rPr>
-        <w:rFonts w:ascii="Symbol" w:hAnsi="Symbol" w:cs="Symbol" w:hint="default"/>
-      </w:rPr>
-    </w:lvl>
-    <w:lvl w:ilvl="3">
-      <w:start w:val="1"/>
-      <w:numFmt w:val="bullet"/>
-      <w:lvlText w:val=""/>
-      <w:lvlJc w:val="start"/>
-      <w:pPr>
-        <w:tabs>
-          <w:tab w:val="num" w:pos="2836"/>
-        </w:tabs>
-        <w:ind w:start="2836" w:hanging="283"/>
-      </w:pPr>
-      <w:rPr>
-        <w:rFonts w:ascii="Symbol" w:hAnsi="Symbol" w:cs="Symbol" w:hint="default"/>
-      </w:rPr>
-    </w:lvl>
-    <w:lvl w:ilvl="4">
-      <w:start w:val="1"/>
-      <w:numFmt w:val="bullet"/>
-      <w:lvlText w:val=""/>
-      <w:lvlJc w:val="start"/>
-      <w:pPr>
-        <w:tabs>
-          <w:tab w:val="num" w:pos="3545"/>
-        </w:tabs>
-        <w:ind w:start="3545" w:hanging="283"/>
-      </w:pPr>
-      <w:rPr>
-        <w:rFonts w:ascii="Symbol" w:hAnsi="Symbol" w:cs="Symbol" w:hint="default"/>
-      </w:rPr>
-    </w:lvl>
-    <w:lvl w:ilvl="5">
-      <w:start w:val="1"/>
-      <w:numFmt w:val="bullet"/>
-      <w:lvlText w:val=""/>
-      <w:lvlJc w:val="start"/>
-      <w:pPr>
-        <w:tabs>
-          <w:tab w:val="num" w:pos="4254"/>
-        </w:tabs>
-        <w:ind w:start="4254" w:hanging="283"/>
-      </w:pPr>
-      <w:rPr>
-        <w:rFonts w:ascii="Symbol" w:hAnsi="Symbol" w:cs="Symbol" w:hint="default"/>
-      </w:rPr>
-    </w:lvl>
-    <w:lvl w:ilvl="6">
-      <w:start w:val="1"/>
-      <w:numFmt w:val="bullet"/>
-      <w:lvlText w:val=""/>
-      <w:lvlJc w:val="start"/>
-      <w:pPr>
-        <w:tabs>
-          <w:tab w:val="num" w:pos="4963"/>
-        </w:tabs>
-        <w:ind w:start="4963" w:hanging="283"/>
-      </w:pPr>
-      <w:rPr>
-        <w:rFonts w:ascii="Symbol" w:hAnsi="Symbol" w:cs="Symbol" w:hint="default"/>
-      </w:rPr>
-    </w:lvl>
-    <w:lvl w:ilvl="7">
-      <w:start w:val="1"/>
-      <w:numFmt w:val="bullet"/>
-      <w:lvlText w:val=""/>
-      <w:lvlJc w:val="start"/>
-      <w:pPr>
-        <w:tabs>
-          <w:tab w:val="num" w:pos="5672"/>
-        </w:tabs>
-        <w:ind w:start="5672" w:hanging="283"/>
-      </w:pPr>
-      <w:rPr>
-        <w:rFonts w:ascii="Symbol" w:hAnsi="Symbol" w:cs="Symbol" w:hint="default"/>
-      </w:rPr>
-    </w:lvl>
-    <w:lvl w:ilvl="8">
-      <w:start w:val="1"/>
-      <w:numFmt w:val="bullet"/>
-      <w:lvlText w:val=""/>
-      <w:lvlJc w:val="start"/>
-      <w:pPr>
-        <w:tabs>
-          <w:tab w:val="num" w:pos="6381"/>
-        </w:tabs>
-        <w:ind w:start="6381" w:hanging="283"/>
-      </w:pPr>
-      <w:rPr>
-        <w:rFonts w:ascii="Symbol" w:hAnsi="Symbol" w:cs="Symbol" w:hint="default"/>
-      </w:rPr>
-    </w:lvl>
-  </w:abstractNum>
-  <w:abstractNum w:abstractNumId="5">
-    <w:lvl w:ilvl="0">
-      <w:start w:val="1"/>
-      <w:numFmt w:val="decimal"/>
-      <w:lvlText w:val="%1."/>
-      <w:lvlJc w:val="start"/>
-      <w:pPr>
-        <w:tabs>
-          <w:tab w:val="num" w:pos="709"/>
-        </w:tabs>
-        <w:ind w:start="709" w:hanging="283"/>
-      </w:pPr>
-      <w:rPr/>
-    </w:lvl>
-    <w:lvl w:ilvl="1">
-      <w:start w:val="1"/>
-      <w:numFmt w:val="decimal"/>
-      <w:lvlText w:val="%2."/>
-      <w:lvlJc w:val="start"/>
-      <w:pPr>
-        <w:tabs>
-          <w:tab w:val="num" w:pos="1418"/>
-        </w:tabs>
-        <w:ind w:start="1418" w:hanging="283"/>
-      </w:pPr>
-      <w:rPr/>
-    </w:lvl>
-    <w:lvl w:ilvl="2">
-      <w:start w:val="1"/>
-      <w:numFmt w:val="decimal"/>
-      <w:lvlText w:val="%3."/>
-      <w:lvlJc w:val="start"/>
-      <w:pPr>
-        <w:tabs>
-          <w:tab w:val="num" w:pos="2127"/>
-        </w:tabs>
-        <w:ind w:start="2127" w:hanging="283"/>
-      </w:pPr>
-      <w:rPr/>
-    </w:lvl>
-    <w:lvl w:ilvl="3">
-      <w:start w:val="1"/>
-      <w:numFmt w:val="decimal"/>
-      <w:lvlText w:val="%4."/>
-      <w:lvlJc w:val="start"/>
-      <w:pPr>
-        <w:tabs>
-          <w:tab w:val="num" w:pos="2836"/>
-        </w:tabs>
-        <w:ind w:start="2836" w:hanging="283"/>
-      </w:pPr>
-      <w:rPr/>
-    </w:lvl>
-    <w:lvl w:ilvl="4">
-      <w:start w:val="1"/>
-      <w:numFmt w:val="decimal"/>
-      <w:lvlText w:val="%5."/>
-      <w:lvlJc w:val="start"/>
-      <w:pPr>
-        <w:tabs>
-          <w:tab w:val="num" w:pos="3545"/>
-        </w:tabs>
-        <w:ind w:start="3545" w:hanging="283"/>
-      </w:pPr>
-      <w:rPr/>
-    </w:lvl>
-    <w:lvl w:ilvl="5">
-      <w:start w:val="1"/>
-      <w:numFmt w:val="decimal"/>
-      <w:lvlText w:val="%6."/>
-      <w:lvlJc w:val="start"/>
-      <w:pPr>
-        <w:tabs>
-          <w:tab w:val="num" w:pos="4254"/>
-        </w:tabs>
-        <w:ind w:start="4254" w:hanging="283"/>
-      </w:pPr>
-      <w:rPr/>
-    </w:lvl>
-    <w:lvl w:ilvl="6">
-      <w:start w:val="1"/>
-      <w:numFmt w:val="decimal"/>
-      <w:lvlText w:val="%7."/>
-      <w:lvlJc w:val="start"/>
-      <w:pPr>
-        <w:tabs>
-          <w:tab w:val="num" w:pos="4963"/>
-        </w:tabs>
-        <w:ind w:start="4963" w:hanging="283"/>
-      </w:pPr>
-      <w:rPr/>
-    </w:lvl>
-    <w:lvl w:ilvl="7">
-      <w:start w:val="1"/>
-      <w:numFmt w:val="decimal"/>
-      <w:lvlText w:val="%8."/>
-      <w:lvlJc w:val="start"/>
-      <w:pPr>
-        <w:tabs>
-          <w:tab w:val="num" w:pos="5672"/>
-        </w:tabs>
-        <w:ind w:start="5672" w:hanging="283"/>
-      </w:pPr>
-      <w:rPr/>
-    </w:lvl>
-    <w:lvl w:ilvl="8">
-      <w:start w:val="1"/>
-      <w:numFmt w:val="decimal"/>
-      <w:lvlText w:val="%9."/>
-      <w:lvlJc w:val="start"/>
-      <w:pPr>
-        <w:tabs>
-          <w:tab w:val="num" w:pos="6381"/>
-        </w:tabs>
-        <w:ind w:start="6381" w:hanging="283"/>
-      </w:pPr>
-      <w:rPr/>
-    </w:lvl>
-  </w:abstractNum>
-  <w:abstractNum w:abstractNumId="6">
-    <w:lvl w:ilvl="0">
-      <w:start w:val="1"/>
-      <w:numFmt w:val="decimal"/>
-      <w:lvlText w:val="%1."/>
-      <w:lvlJc w:val="start"/>
-      <w:pPr>
-        <w:tabs>
-          <w:tab w:val="num" w:pos="709"/>
-        </w:tabs>
-        <w:ind w:start="709" w:hanging="283"/>
-      </w:pPr>
-      <w:rPr/>
-    </w:lvl>
-    <w:lvl w:ilvl="1">
-      <w:start w:val="1"/>
-      <w:numFmt w:val="decimal"/>
-      <w:lvlText w:val="%2."/>
-      <w:lvlJc w:val="start"/>
-      <w:pPr>
-        <w:tabs>
-          <w:tab w:val="num" w:pos="1418"/>
-        </w:tabs>
-        <w:ind w:start="1418" w:hanging="283"/>
-      </w:pPr>
-      <w:rPr/>
-    </w:lvl>
-    <w:lvl w:ilvl="2">
-      <w:start w:val="1"/>
-      <w:numFmt w:val="decimal"/>
-      <w:lvlText w:val="%3."/>
-      <w:lvlJc w:val="start"/>
-      <w:pPr>
-        <w:tabs>
-          <w:tab w:val="num" w:pos="2127"/>
-        </w:tabs>
-        <w:ind w:start="2127" w:hanging="283"/>
-      </w:pPr>
-      <w:rPr/>
-    </w:lvl>
-    <w:lvl w:ilvl="3">
-      <w:start w:val="1"/>
-      <w:numFmt w:val="decimal"/>
-      <w:lvlText w:val="%4."/>
-      <w:lvlJc w:val="start"/>
-      <w:pPr>
-        <w:tabs>
-          <w:tab w:val="num" w:pos="2836"/>
-        </w:tabs>
-        <w:ind w:start="2836" w:hanging="283"/>
-      </w:pPr>
-      <w:rPr/>
-    </w:lvl>
-    <w:lvl w:ilvl="4">
-      <w:start w:val="1"/>
-      <w:numFmt w:val="decimal"/>
-      <w:lvlText w:val="%5."/>
-      <w:lvlJc w:val="start"/>
-      <w:pPr>
-        <w:tabs>
-          <w:tab w:val="num" w:pos="3545"/>
-        </w:tabs>
-        <w:ind w:start="3545" w:hanging="283"/>
-      </w:pPr>
-      <w:rPr/>
-    </w:lvl>
-    <w:lvl w:ilvl="5">
-      <w:start w:val="1"/>
-      <w:numFmt w:val="decimal"/>
-      <w:lvlText w:val="%6."/>
-      <w:lvlJc w:val="start"/>
-      <w:pPr>
-        <w:tabs>
-          <w:tab w:val="num" w:pos="4254"/>
-        </w:tabs>
-        <w:ind w:start="4254" w:hanging="283"/>
-      </w:pPr>
-      <w:rPr/>
-    </w:lvl>
-    <w:lvl w:ilvl="6">
-      <w:start w:val="1"/>
-      <w:numFmt w:val="decimal"/>
-      <w:lvlText w:val="%7."/>
-      <w:lvlJc w:val="start"/>
-      <w:pPr>
-        <w:tabs>
-          <w:tab w:val="num" w:pos="4963"/>
-        </w:tabs>
-        <w:ind w:start="4963" w:hanging="283"/>
-      </w:pPr>
-      <w:rPr/>
-    </w:lvl>
-    <w:lvl w:ilvl="7">
-      <w:start w:val="1"/>
-      <w:numFmt w:val="decimal"/>
-      <w:lvlText w:val="%8."/>
-      <w:lvlJc w:val="start"/>
-      <w:pPr>
-        <w:tabs>
-          <w:tab w:val="num" w:pos="5672"/>
-        </w:tabs>
-        <w:ind w:start="5672" w:hanging="283"/>
-      </w:pPr>
-      <w:rPr/>
-    </w:lvl>
-    <w:lvl w:ilvl="8">
-      <w:start w:val="1"/>
-      <w:numFmt w:val="decimal"/>
-      <w:lvlText w:val="%9."/>
-      <w:lvlJc w:val="start"/>
-      <w:pPr>
-        <w:tabs>
-          <w:tab w:val="num" w:pos="6381"/>
-        </w:tabs>
-        <w:ind w:start="6381" w:hanging="283"/>
-      </w:pPr>
-      <w:rPr/>
-    </w:lvl>
-  </w:abstractNum>
-  <w:abstractNum w:abstractNumId="7">
-    <w:lvl w:ilvl="0">
-      <w:start w:val="1"/>
-      <w:numFmt w:val="decimal"/>
-      <w:lvlText w:val="%1."/>
-      <w:lvlJc w:val="start"/>
-      <w:pPr>
-        <w:tabs>
-          <w:tab w:val="num" w:pos="709"/>
-        </w:tabs>
-        <w:ind w:start="709" w:hanging="283"/>
-      </w:pPr>
-      <w:rPr/>
-    </w:lvl>
-    <w:lvl w:ilvl="1">
-      <w:start w:val="1"/>
-      <w:numFmt w:val="decimal"/>
-      <w:lvlText w:val="%2."/>
-      <w:lvlJc w:val="start"/>
-      <w:pPr>
-        <w:tabs>
-          <w:tab w:val="num" w:pos="1418"/>
-        </w:tabs>
-        <w:ind w:start="1418" w:hanging="283"/>
-      </w:pPr>
-      <w:rPr/>
-    </w:lvl>
-    <w:lvl w:ilvl="2">
-      <w:start w:val="1"/>
-      <w:numFmt w:val="decimal"/>
-      <w:lvlText w:val="%3."/>
-      <w:lvlJc w:val="start"/>
-      <w:pPr>
-        <w:tabs>
-          <w:tab w:val="num" w:pos="2127"/>
-        </w:tabs>
-        <w:ind w:start="2127" w:hanging="283"/>
-      </w:pPr>
-      <w:rPr/>
-    </w:lvl>
-    <w:lvl w:ilvl="3">
-      <w:start w:val="1"/>
-      <w:numFmt w:val="decimal"/>
-      <w:lvlText w:val="%4."/>
-      <w:lvlJc w:val="start"/>
-      <w:pPr>
-        <w:tabs>
-          <w:tab w:val="num" w:pos="2836"/>
-        </w:tabs>
-        <w:ind w:start="2836" w:hanging="283"/>
-      </w:pPr>
-      <w:rPr/>
-    </w:lvl>
-    <w:lvl w:ilvl="4">
-      <w:start w:val="1"/>
-      <w:numFmt w:val="decimal"/>
-      <w:lvlText w:val="%5."/>
-      <w:lvlJc w:val="start"/>
-      <w:pPr>
-        <w:tabs>
-          <w:tab w:val="num" w:pos="3545"/>
-        </w:tabs>
-        <w:ind w:start="3545" w:hanging="283"/>
-      </w:pPr>
-      <w:rPr/>
-    </w:lvl>
-    <w:lvl w:ilvl="5">
-      <w:start w:val="1"/>
-      <w:numFmt w:val="decimal"/>
-      <w:lvlText w:val="%6."/>
-      <w:lvlJc w:val="start"/>
-      <w:pPr>
-        <w:tabs>
-          <w:tab w:val="num" w:pos="4254"/>
-        </w:tabs>
-        <w:ind w:start="4254" w:hanging="283"/>
-      </w:pPr>
-      <w:rPr/>
-    </w:lvl>
-    <w:lvl w:ilvl="6">
-      <w:start w:val="1"/>
-      <w:numFmt w:val="decimal"/>
-      <w:lvlText w:val="%7."/>
-      <w:lvlJc w:val="start"/>
-      <w:pPr>
-        <w:tabs>
-          <w:tab w:val="num" w:pos="4963"/>
-        </w:tabs>
-        <w:ind w:start="4963" w:hanging="283"/>
-      </w:pPr>
-      <w:rPr/>
-    </w:lvl>
-    <w:lvl w:ilvl="7">
-      <w:start w:val="1"/>
-      <w:numFmt w:val="decimal"/>
-      <w:lvlText w:val="%8."/>
-      <w:lvlJc w:val="start"/>
-      <w:pPr>
-        <w:tabs>
-          <w:tab w:val="num" w:pos="5672"/>
-        </w:tabs>
-        <w:ind w:start="5672" w:hanging="283"/>
-      </w:pPr>
-      <w:rPr/>
-    </w:lvl>
-    <w:lvl w:ilvl="8">
-      <w:start w:val="1"/>
-      <w:numFmt w:val="decimal"/>
-      <w:lvlText w:val="%9."/>
-      <w:lvlJc w:val="start"/>
-      <w:pPr>
-        <w:tabs>
-          <w:tab w:val="num" w:pos="6381"/>
-        </w:tabs>
-        <w:ind w:start="6381" w:hanging="283"/>
-      </w:pPr>
-      <w:rPr/>
-    </w:lvl>
-  </w:abstractNum>
-  <w:abstractNum w:abstractNumId="8">
     <w:lvl w:ilvl="0">
       <w:start w:val="1"/>
       <w:numFmt w:val="none"/>
@@ -4903,18 +3672,6 @@
   </w:num>
   <w:num w:numId="4">
     <w:abstractNumId w:val="4"/>
-  </w:num>
-  <w:num w:numId="5">
-    <w:abstractNumId w:val="5"/>
-  </w:num>
-  <w:num w:numId="6">
-    <w:abstractNumId w:val="6"/>
-  </w:num>
-  <w:num w:numId="7">
-    <w:abstractNumId w:val="7"/>
-  </w:num>
-  <w:num w:numId="8">
-    <w:abstractNumId w:val="8"/>
   </w:num>
 </w:numbering>
 </file>

</xml_diff>